<commit_message>
docs: Zugangsadressen (HTTPS + intern ohne HTTPS) im Benutzerhandbuch
Neue Sektion 3.1 mit Tabelle (Chat/Verwaltung/Keycloak je HTTPS und
http://IP:port) + Hinweise (/admin-Pfad, Token-fehlt-an-der-Wurzel,
Keycloak-Konsole). Anmelde-Schritt in Teil C um http://IP:3000 ergaenzt.

Co-Authored-By: Claude Fable 5 <noreply@anthropic.com>
</commit_message>
<xml_diff>
--- a/docs/Benutzerhandbuch-kv-brain.docx
+++ b/docs/Benutzerhandbuch-kv-brain.docx
@@ -1967,7 +1967,7 @@
           <w:sz w:val="24"/>
           <w:szCs w:val="24"/>
         </w:rPr>
-        <w:t xml:space="preserve">3.1  Single Sign-On (Keycloak)</w:t>
+        <w:t xml:space="preserve">3.1  Zugangsadressen</w:t>
       </w:r>
     </w:p>
     <w:p>
@@ -1981,9 +1981,514 @@
           <w:sz w:val="20"/>
           <w:szCs w:val="20"/>
         </w:rPr>
-        <w:t xml:space="preserve">Die Anmeldung erfolgt zentral über Keycloak. Wer angemeldet ist, kann Chat und Wissensbasis nutzen, ohne sich erneut anzumelden. Die Anmeldedaten kommen entweder aus lokal in Keycloak angelegten Konten oder — falls angebunden — aus dem Active Directory.</w:t>
-      </w:r>
-    </w:p>
+        <w:t xml:space="preserve">Die Plattform ist über zwei Oberflächen erreichbar: den Chat (für Anwender) und die Verwaltung (für Administratoren). Im HTTPS-Betrieb laufen beide über den Hostnamen; im rein internen Betrieb ohne HTTPS direkt über die IP und den jeweiligen Port.</w:t>
+      </w:r>
+    </w:p>
+    <w:tbl>
+      <w:tblPr>
+        <w:tblW w:type="dxa" w:w="9638"/>
+        <w:tblBorders>
+          <w:top w:val="single" w:color="auto" w:sz="4"/>
+          <w:left w:val="single" w:color="auto" w:sz="4"/>
+          <w:bottom w:val="single" w:color="auto" w:sz="4"/>
+          <w:right w:val="single" w:color="auto" w:sz="4"/>
+          <w:insideH w:val="single" w:color="auto" w:sz="4"/>
+          <w:insideV w:val="single" w:color="auto" w:sz="4"/>
+        </w:tblBorders>
+      </w:tblPr>
+      <w:tblGrid>
+        <w:gridCol w:w="2600"/>
+        <w:gridCol w:w="3519"/>
+        <w:gridCol w:w="3519"/>
+      </w:tblGrid>
+      <w:tr>
+        <w:trPr>
+          <w:tblHeader/>
+        </w:trPr>
+        <w:tc>
+          <w:tcPr>
+            <w:tcW w:type="dxa" w:w="2600"/>
+            <w:tcBorders>
+              <w:top w:val="single" w:color="CCCCCC" w:sz="1"/>
+              <w:left w:val="single" w:color="CCCCCC" w:sz="1"/>
+              <w:bottom w:val="single" w:color="CCCCCC" w:sz="1"/>
+              <w:right w:val="single" w:color="CCCCCC" w:sz="1"/>
+            </w:tcBorders>
+            <w:shd w:fill="235FA6" w:val="clear"/>
+            <w:tcMar>
+              <w:top w:type="dxa" w:w="70"/>
+              <w:left w:type="dxa" w:w="110"/>
+              <w:bottom w:type="dxa" w:w="70"/>
+              <w:right w:type="dxa" w:w="110"/>
+            </w:tcMar>
+          </w:tcPr>
+          <w:p>
+            <w:r>
+              <w:rPr>
+                <w:rFonts w:ascii="Arial" w:cs="Arial" w:eastAsia="Arial" w:hAnsi="Arial"/>
+                <w:b/>
+                <w:bCs/>
+                <w:color w:val="FFFFFF"/>
+                <w:sz w:val="19"/>
+                <w:szCs w:val="19"/>
+              </w:rPr>
+              <w:t xml:space="preserve">Zweck</w:t>
+            </w:r>
+          </w:p>
+        </w:tc>
+        <w:tc>
+          <w:tcPr>
+            <w:tcW w:type="dxa" w:w="3519"/>
+            <w:tcBorders>
+              <w:top w:val="single" w:color="CCCCCC" w:sz="1"/>
+              <w:left w:val="single" w:color="CCCCCC" w:sz="1"/>
+              <w:bottom w:val="single" w:color="CCCCCC" w:sz="1"/>
+              <w:right w:val="single" w:color="CCCCCC" w:sz="1"/>
+            </w:tcBorders>
+            <w:shd w:fill="235FA6" w:val="clear"/>
+            <w:tcMar>
+              <w:top w:type="dxa" w:w="70"/>
+              <w:left w:type="dxa" w:w="110"/>
+              <w:bottom w:type="dxa" w:w="70"/>
+              <w:right w:type="dxa" w:w="110"/>
+            </w:tcMar>
+          </w:tcPr>
+          <w:p>
+            <w:r>
+              <w:rPr>
+                <w:rFonts w:ascii="Arial" w:cs="Arial" w:eastAsia="Arial" w:hAnsi="Arial"/>
+                <w:b/>
+                <w:bCs/>
+                <w:color w:val="FFFFFF"/>
+                <w:sz w:val="19"/>
+                <w:szCs w:val="19"/>
+              </w:rPr>
+              <w:t xml:space="preserve">Mit HTTPS (Hostname)</w:t>
+            </w:r>
+          </w:p>
+        </w:tc>
+        <w:tc>
+          <w:tcPr>
+            <w:tcW w:type="dxa" w:w="3519"/>
+            <w:tcBorders>
+              <w:top w:val="single" w:color="CCCCCC" w:sz="1"/>
+              <w:left w:val="single" w:color="CCCCCC" w:sz="1"/>
+              <w:bottom w:val="single" w:color="CCCCCC" w:sz="1"/>
+              <w:right w:val="single" w:color="CCCCCC" w:sz="1"/>
+            </w:tcBorders>
+            <w:shd w:fill="235FA6" w:val="clear"/>
+            <w:tcMar>
+              <w:top w:type="dxa" w:w="70"/>
+              <w:left w:type="dxa" w:w="110"/>
+              <w:bottom w:type="dxa" w:w="70"/>
+              <w:right w:type="dxa" w:w="110"/>
+            </w:tcMar>
+          </w:tcPr>
+          <w:p>
+            <w:r>
+              <w:rPr>
+                <w:rFonts w:ascii="Arial" w:cs="Arial" w:eastAsia="Arial" w:hAnsi="Arial"/>
+                <w:b/>
+                <w:bCs/>
+                <w:color w:val="FFFFFF"/>
+                <w:sz w:val="19"/>
+                <w:szCs w:val="19"/>
+              </w:rPr>
+              <w:t xml:space="preserve">Intern ohne HTTPS (IP)</w:t>
+            </w:r>
+          </w:p>
+        </w:tc>
+      </w:tr>
+      <w:tr>
+        <w:tc>
+          <w:tcPr>
+            <w:tcW w:type="dxa" w:w="2600"/>
+            <w:tcBorders>
+              <w:top w:val="single" w:color="CCCCCC" w:sz="1"/>
+              <w:left w:val="single" w:color="CCCCCC" w:sz="1"/>
+              <w:bottom w:val="single" w:color="CCCCCC" w:sz="1"/>
+              <w:right w:val="single" w:color="CCCCCC" w:sz="1"/>
+            </w:tcBorders>
+            <w:shd w:fill="FFFFFF" w:val="clear"/>
+            <w:tcMar>
+              <w:top w:type="dxa" w:w="70"/>
+              <w:left w:type="dxa" w:w="110"/>
+              <w:bottom w:type="dxa" w:w="70"/>
+              <w:right w:type="dxa" w:w="110"/>
+            </w:tcMar>
+          </w:tcPr>
+          <w:p>
+            <w:r>
+              <w:rPr>
+                <w:rFonts w:ascii="Arial" w:cs="Arial" w:eastAsia="Arial" w:hAnsi="Arial"/>
+                <w:color w:val="333333"/>
+                <w:sz w:val="19"/>
+                <w:szCs w:val="19"/>
+              </w:rPr>
+              <w:t xml:space="preserve">Chat (Anwender)</w:t>
+            </w:r>
+          </w:p>
+        </w:tc>
+        <w:tc>
+          <w:tcPr>
+            <w:tcW w:type="dxa" w:w="3519"/>
+            <w:tcBorders>
+              <w:top w:val="single" w:color="CCCCCC" w:sz="1"/>
+              <w:left w:val="single" w:color="CCCCCC" w:sz="1"/>
+              <w:bottom w:val="single" w:color="CCCCCC" w:sz="1"/>
+              <w:right w:val="single" w:color="CCCCCC" w:sz="1"/>
+            </w:tcBorders>
+            <w:shd w:fill="FFFFFF" w:val="clear"/>
+            <w:tcMar>
+              <w:top w:type="dxa" w:w="70"/>
+              <w:left w:type="dxa" w:w="110"/>
+              <w:bottom w:type="dxa" w:w="70"/>
+              <w:right w:type="dxa" w:w="110"/>
+            </w:tcMar>
+          </w:tcPr>
+          <w:p>
+            <w:r>
+              <w:rPr>
+                <w:rFonts w:ascii="Arial" w:cs="Arial" w:eastAsia="Arial" w:hAnsi="Arial"/>
+                <w:color w:val="333333"/>
+                <w:sz w:val="19"/>
+                <w:szCs w:val="19"/>
+              </w:rPr>
+              <w:t xml:space="preserve">https://&lt;hostname&gt;</w:t>
+            </w:r>
+          </w:p>
+        </w:tc>
+        <w:tc>
+          <w:tcPr>
+            <w:tcW w:type="dxa" w:w="3519"/>
+            <w:tcBorders>
+              <w:top w:val="single" w:color="CCCCCC" w:sz="1"/>
+              <w:left w:val="single" w:color="CCCCCC" w:sz="1"/>
+              <w:bottom w:val="single" w:color="CCCCCC" w:sz="1"/>
+              <w:right w:val="single" w:color="CCCCCC" w:sz="1"/>
+            </w:tcBorders>
+            <w:shd w:fill="FFFFFF" w:val="clear"/>
+            <w:tcMar>
+              <w:top w:type="dxa" w:w="70"/>
+              <w:left w:type="dxa" w:w="110"/>
+              <w:bottom w:type="dxa" w:w="70"/>
+              <w:right w:type="dxa" w:w="110"/>
+            </w:tcMar>
+          </w:tcPr>
+          <w:p>
+            <w:r>
+              <w:rPr>
+                <w:rFonts w:ascii="Arial" w:cs="Arial" w:eastAsia="Arial" w:hAnsi="Arial"/>
+                <w:color w:val="333333"/>
+                <w:sz w:val="19"/>
+                <w:szCs w:val="19"/>
+              </w:rPr>
+              <w:t xml:space="preserve">http://&lt;IP&gt;:3000</w:t>
+            </w:r>
+          </w:p>
+        </w:tc>
+      </w:tr>
+      <w:tr>
+        <w:tc>
+          <w:tcPr>
+            <w:tcW w:type="dxa" w:w="2600"/>
+            <w:tcBorders>
+              <w:top w:val="single" w:color="CCCCCC" w:sz="1"/>
+              <w:left w:val="single" w:color="CCCCCC" w:sz="1"/>
+              <w:bottom w:val="single" w:color="CCCCCC" w:sz="1"/>
+              <w:right w:val="single" w:color="CCCCCC" w:sz="1"/>
+            </w:tcBorders>
+            <w:shd w:fill="F5F5F5" w:val="clear"/>
+            <w:tcMar>
+              <w:top w:type="dxa" w:w="70"/>
+              <w:left w:type="dxa" w:w="110"/>
+              <w:bottom w:type="dxa" w:w="70"/>
+              <w:right w:type="dxa" w:w="110"/>
+            </w:tcMar>
+          </w:tcPr>
+          <w:p>
+            <w:r>
+              <w:rPr>
+                <w:rFonts w:ascii="Arial" w:cs="Arial" w:eastAsia="Arial" w:hAnsi="Arial"/>
+                <w:color w:val="333333"/>
+                <w:sz w:val="19"/>
+                <w:szCs w:val="19"/>
+              </w:rPr>
+              <w:t xml:space="preserve">Verwaltung (Admin)</w:t>
+            </w:r>
+          </w:p>
+        </w:tc>
+        <w:tc>
+          <w:tcPr>
+            <w:tcW w:type="dxa" w:w="3519"/>
+            <w:tcBorders>
+              <w:top w:val="single" w:color="CCCCCC" w:sz="1"/>
+              <w:left w:val="single" w:color="CCCCCC" w:sz="1"/>
+              <w:bottom w:val="single" w:color="CCCCCC" w:sz="1"/>
+              <w:right w:val="single" w:color="CCCCCC" w:sz="1"/>
+            </w:tcBorders>
+            <w:shd w:fill="F5F5F5" w:val="clear"/>
+            <w:tcMar>
+              <w:top w:type="dxa" w:w="70"/>
+              <w:left w:type="dxa" w:w="110"/>
+              <w:bottom w:type="dxa" w:w="70"/>
+              <w:right w:type="dxa" w:w="110"/>
+            </w:tcMar>
+          </w:tcPr>
+          <w:p>
+            <w:r>
+              <w:rPr>
+                <w:rFonts w:ascii="Arial" w:cs="Arial" w:eastAsia="Arial" w:hAnsi="Arial"/>
+                <w:color w:val="333333"/>
+                <w:sz w:val="19"/>
+                <w:szCs w:val="19"/>
+              </w:rPr>
+              <w:t xml:space="preserve">https://&lt;hostname&gt;/admin</w:t>
+            </w:r>
+          </w:p>
+        </w:tc>
+        <w:tc>
+          <w:tcPr>
+            <w:tcW w:type="dxa" w:w="3519"/>
+            <w:tcBorders>
+              <w:top w:val="single" w:color="CCCCCC" w:sz="1"/>
+              <w:left w:val="single" w:color="CCCCCC" w:sz="1"/>
+              <w:bottom w:val="single" w:color="CCCCCC" w:sz="1"/>
+              <w:right w:val="single" w:color="CCCCCC" w:sz="1"/>
+            </w:tcBorders>
+            <w:shd w:fill="F5F5F5" w:val="clear"/>
+            <w:tcMar>
+              <w:top w:type="dxa" w:w="70"/>
+              <w:left w:type="dxa" w:w="110"/>
+              <w:bottom w:type="dxa" w:w="70"/>
+              <w:right w:type="dxa" w:w="110"/>
+            </w:tcMar>
+          </w:tcPr>
+          <w:p>
+            <w:r>
+              <w:rPr>
+                <w:rFonts w:ascii="Arial" w:cs="Arial" w:eastAsia="Arial" w:hAnsi="Arial"/>
+                <w:color w:val="333333"/>
+                <w:sz w:val="19"/>
+                <w:szCs w:val="19"/>
+              </w:rPr>
+              <w:t xml:space="preserve">http://&lt;IP&gt;:8000/admin</w:t>
+            </w:r>
+          </w:p>
+        </w:tc>
+      </w:tr>
+      <w:tr>
+        <w:tc>
+          <w:tcPr>
+            <w:tcW w:type="dxa" w:w="2600"/>
+            <w:tcBorders>
+              <w:top w:val="single" w:color="CCCCCC" w:sz="1"/>
+              <w:left w:val="single" w:color="CCCCCC" w:sz="1"/>
+              <w:bottom w:val="single" w:color="CCCCCC" w:sz="1"/>
+              <w:right w:val="single" w:color="CCCCCC" w:sz="1"/>
+            </w:tcBorders>
+            <w:shd w:fill="FFFFFF" w:val="clear"/>
+            <w:tcMar>
+              <w:top w:type="dxa" w:w="70"/>
+              <w:left w:type="dxa" w:w="110"/>
+              <w:bottom w:type="dxa" w:w="70"/>
+              <w:right w:type="dxa" w:w="110"/>
+            </w:tcMar>
+          </w:tcPr>
+          <w:p>
+            <w:r>
+              <w:rPr>
+                <w:rFonts w:ascii="Arial" w:cs="Arial" w:eastAsia="Arial" w:hAnsi="Arial"/>
+                <w:color w:val="333333"/>
+                <w:sz w:val="19"/>
+                <w:szCs w:val="19"/>
+              </w:rPr>
+              <w:t xml:space="preserve">Keycloak-Konsole</w:t>
+            </w:r>
+          </w:p>
+        </w:tc>
+        <w:tc>
+          <w:tcPr>
+            <w:tcW w:type="dxa" w:w="3519"/>
+            <w:tcBorders>
+              <w:top w:val="single" w:color="CCCCCC" w:sz="1"/>
+              <w:left w:val="single" w:color="CCCCCC" w:sz="1"/>
+              <w:bottom w:val="single" w:color="CCCCCC" w:sz="1"/>
+              <w:right w:val="single" w:color="CCCCCC" w:sz="1"/>
+            </w:tcBorders>
+            <w:shd w:fill="FFFFFF" w:val="clear"/>
+            <w:tcMar>
+              <w:top w:type="dxa" w:w="70"/>
+              <w:left w:type="dxa" w:w="110"/>
+              <w:bottom w:type="dxa" w:w="70"/>
+              <w:right w:type="dxa" w:w="110"/>
+            </w:tcMar>
+          </w:tcPr>
+          <w:p>
+            <w:r>
+              <w:rPr>
+                <w:rFonts w:ascii="Arial" w:cs="Arial" w:eastAsia="Arial" w:hAnsi="Arial"/>
+                <w:color w:val="333333"/>
+                <w:sz w:val="19"/>
+                <w:szCs w:val="19"/>
+              </w:rPr>
+              <w:t xml:space="preserve">https://&lt;hostname&gt;/auth/admin/</w:t>
+            </w:r>
+          </w:p>
+        </w:tc>
+        <w:tc>
+          <w:tcPr>
+            <w:tcW w:type="dxa" w:w="3519"/>
+            <w:tcBorders>
+              <w:top w:val="single" w:color="CCCCCC" w:sz="1"/>
+              <w:left w:val="single" w:color="CCCCCC" w:sz="1"/>
+              <w:bottom w:val="single" w:color="CCCCCC" w:sz="1"/>
+              <w:right w:val="single" w:color="CCCCCC" w:sz="1"/>
+            </w:tcBorders>
+            <w:shd w:fill="FFFFFF" w:val="clear"/>
+            <w:tcMar>
+              <w:top w:type="dxa" w:w="70"/>
+              <w:left w:type="dxa" w:w="110"/>
+              <w:bottom w:type="dxa" w:w="70"/>
+              <w:right w:type="dxa" w:w="110"/>
+            </w:tcMar>
+          </w:tcPr>
+          <w:p>
+            <w:r>
+              <w:rPr>
+                <w:rFonts w:ascii="Arial" w:cs="Arial" w:eastAsia="Arial" w:hAnsi="Arial"/>
+                <w:color w:val="333333"/>
+                <w:sz w:val="19"/>
+                <w:szCs w:val="19"/>
+              </w:rPr>
+              <w:t xml:space="preserve">http://&lt;IP&gt;:8080/auth/admin/</w:t>
+            </w:r>
+          </w:p>
+        </w:tc>
+      </w:tr>
+    </w:tbl>
+    <w:p>
+      <w:pPr>
+        <w:spacing w:after="70" w:before="70"/>
+      </w:pPr>
+      <w:r>
+        <w:rPr>
+          <w:rFonts w:ascii="Arial" w:cs="Arial" w:eastAsia="Arial" w:hAnsi="Arial"/>
+          <w:color w:val="333333"/>
+          <w:sz w:val="20"/>
+          <w:szCs w:val="20"/>
+        </w:rPr>
+        <w:t xml:space="preserve">Beispiel intern: http://192.168.126.25:8000/admin (Verwaltung) und http://192.168.126.25:3000 (Chat).</w:t>
+      </w:r>
+    </w:p>
+    <w:tbl>
+      <w:tblPr>
+        <w:tblW w:type="dxa" w:w="9638"/>
+        <w:tblBorders>
+          <w:top w:val="single" w:color="auto" w:sz="4"/>
+          <w:left w:val="single" w:color="auto" w:sz="4"/>
+          <w:bottom w:val="single" w:color="auto" w:sz="4"/>
+          <w:right w:val="single" w:color="auto" w:sz="4"/>
+          <w:insideH w:val="single" w:color="auto" w:sz="4"/>
+          <w:insideV w:val="single" w:color="auto" w:sz="4"/>
+        </w:tblBorders>
+      </w:tblPr>
+      <w:tblGrid>
+        <w:gridCol w:w="9638"/>
+      </w:tblGrid>
+      <w:tr>
+        <w:tc>
+          <w:tcPr>
+            <w:tcW w:type="dxa" w:w="9638"/>
+            <w:tcBorders>
+              <w:top w:val="single" w:color="B8860B" w:sz="1"/>
+              <w:left w:val="single" w:color="B8860B" w:sz="14"/>
+              <w:bottom w:val="single" w:color="B8860B" w:sz="1"/>
+              <w:right w:val="single" w:color="B8860B" w:sz="1"/>
+            </w:tcBorders>
+            <w:shd w:fill="FFFBE6" w:val="clear"/>
+            <w:tcMar>
+              <w:top w:type="dxa" w:w="110"/>
+              <w:left w:type="dxa" w:w="200"/>
+              <w:bottom w:type="dxa" w:w="110"/>
+              <w:right w:type="dxa" w:w="200"/>
+            </w:tcMar>
+          </w:tcPr>
+          <w:p>
+            <w:pPr>
+              <w:spacing w:after="50" w:before="50"/>
+            </w:pPr>
+            <w:r>
+              <w:rPr>
+                <w:rFonts w:ascii="Arial" w:cs="Arial" w:eastAsia="Arial" w:hAnsi="Arial"/>
+                <w:b/>
+                <w:bCs/>
+                <w:color w:val="B8860B"/>
+                <w:sz w:val="20"/>
+                <w:szCs w:val="20"/>
+              </w:rPr>
+              <w:t xml:space="preserve">Hinweise</w:t>
+            </w:r>
+          </w:p>
+          <w:p>
+            <w:pPr>
+              <w:spacing w:after="35" w:before="35"/>
+            </w:pPr>
+            <w:r>
+              <w:rPr>
+                <w:rFonts w:ascii="Arial" w:cs="Arial" w:eastAsia="Arial" w:hAnsi="Arial"/>
+                <w:color w:val="333333"/>
+                <w:sz w:val="19"/>
+                <w:szCs w:val="19"/>
+              </w:rPr>
+              <w:t xml:space="preserve">Die Verwaltung liegt unter /admin (mit Schraegstrich: /admin/). Die Wurzel</w:t>
+            </w:r>
+          </w:p>
+          <w:p>
+            <w:pPr>
+              <w:spacing w:after="35" w:before="35"/>
+            </w:pPr>
+            <w:r>
+              <w:rPr>
+                <w:rFonts w:ascii="Arial" w:cs="Arial" w:eastAsia="Arial" w:hAnsi="Arial"/>
+                <w:color w:val="333333"/>
+                <w:sz w:val="19"/>
+                <w:szCs w:val="19"/>
+              </w:rPr>
+              <w:t xml:space="preserve">http://&lt;IP&gt;:8000 ist tokengeschuetzt und zeigt 'Token fehlt' - das ist normal.</w:t>
+            </w:r>
+          </w:p>
+          <w:p>
+            <w:pPr>
+              <w:spacing w:after="35" w:before="35"/>
+            </w:pPr>
+            <w:r>
+              <w:rPr>
+                <w:rFonts w:ascii="Arial" w:cs="Arial" w:eastAsia="Arial" w:hAnsi="Arial"/>
+                <w:color w:val="333333"/>
+                <w:sz w:val="19"/>
+                <w:szCs w:val="19"/>
+              </w:rPr>
+              <w:t xml:space="preserve">Die Keycloak-Konsole ist /auth/admin/ (Anmeldung 'admin' + KEYCLOAK_ADMIN_PASSWORD),</w:t>
+            </w:r>
+          </w:p>
+          <w:p>
+            <w:pPr>
+              <w:spacing w:after="35" w:before="35"/>
+            </w:pPr>
+            <w:r>
+              <w:rPr>
+                <w:rFonts w:ascii="Arial" w:cs="Arial" w:eastAsia="Arial" w:hAnsi="Arial"/>
+                <w:color w:val="333333"/>
+                <w:sz w:val="19"/>
+                <w:szCs w:val="19"/>
+              </w:rPr>
+              <w:t xml:space="preserve">nicht zu verwechseln mit der App-Anmeldeseite.</w:t>
+            </w:r>
+          </w:p>
+        </w:tc>
+      </w:tr>
+    </w:tbl>
     <w:p>
       <w:pPr>
         <w:spacing w:after="40" w:before="40"/>
@@ -2006,7 +2511,46 @@
           <w:sz w:val="24"/>
           <w:szCs w:val="24"/>
         </w:rPr>
-        <w:t xml:space="preserve">3.2  Rollen und Sichtbarkeitsgruppen</w:t>
+        <w:t xml:space="preserve">3.2  Single Sign-On (Keycloak)</w:t>
+      </w:r>
+    </w:p>
+    <w:p>
+      <w:pPr>
+        <w:spacing w:after="70" w:before="70"/>
+      </w:pPr>
+      <w:r>
+        <w:rPr>
+          <w:rFonts w:ascii="Arial" w:cs="Arial" w:eastAsia="Arial" w:hAnsi="Arial"/>
+          <w:color w:val="333333"/>
+          <w:sz w:val="20"/>
+          <w:szCs w:val="20"/>
+        </w:rPr>
+        <w:t xml:space="preserve">Die Anmeldung erfolgt zentral über Keycloak. Wer angemeldet ist, kann Chat und Wissensbasis nutzen, ohne sich erneut anzumelden. Die Anmeldedaten kommen entweder aus lokal in Keycloak angelegten Konten oder — falls angebunden — aus dem Active Directory.</w:t>
+      </w:r>
+    </w:p>
+    <w:p>
+      <w:pPr>
+        <w:spacing w:after="40" w:before="40"/>
+      </w:pPr>
+      <w:r>
+        <w:t xml:space="preserve"/>
+      </w:r>
+    </w:p>
+    <w:p>
+      <w:pPr>
+        <w:pStyle w:val="Heading2"/>
+        <w:spacing w:after="100" w:before="260"/>
+      </w:pPr>
+      <w:r>
+        <w:rPr>
+          <w:rFonts w:ascii="Arial" w:cs="Arial" w:eastAsia="Arial" w:hAnsi="Arial"/>
+          <w:b/>
+          <w:bCs/>
+          <w:color w:val="333333"/>
+          <w:sz w:val="24"/>
+          <w:szCs w:val="24"/>
+        </w:rPr>
+        <w:t xml:space="preserve">3.3  Rollen und Sichtbarkeitsgruppen</w:t>
       </w:r>
     </w:p>
     <w:tbl>
@@ -2369,7 +2913,7 @@
           <w:sz w:val="24"/>
           <w:szCs w:val="24"/>
         </w:rPr>
-        <w:t xml:space="preserve">3.3  Erste Anmeldung als Administrator</w:t>
+        <w:t xml:space="preserve">3.4  Erste Anmeldung als Administrator</w:t>
       </w:r>
     </w:p>
     <w:p>
@@ -6087,7 +6631,7 @@
           <w:sz w:val="20"/>
           <w:szCs w:val="20"/>
         </w:rPr>
-        <w:t xml:space="preserve">Die Adresse der Plattform im Browser öffnen (z.B. https://&lt;hostname&gt;)</w:t>
+        <w:t xml:space="preserve">Die Adresse der Plattform im Browser öffnen — mit HTTPS: https://&lt;hostname&gt; · intern ohne HTTPS: http://&lt;IP&gt;:3000</w:t>
       </w:r>
     </w:p>
     <w:p>

</xml_diff>

<commit_message>
docs: Architektur-Kapitel mit Schema-Diagramm im Benutzerhandbuch
Kapitel 2 erweitert: 2.1 Architekturschema (eingebettetes Diagramm,
Schichten Browser->Caddy->Anwendung->Dienste->Daten/KI, On-Premise-Grenze,
externe Systeme), 2.2 Komponenten, 2.3 Ablauf einer Anfrage (7 Schritte).
architecture.svg auf kv-brain/White-Label aktualisiert + als PNG eingebettet.

Co-Authored-By: Claude Fable 5 <noreply@anthropic.com>
</commit_message>
<xml_diff>
--- a/docs/Benutzerhandbuch-kv-brain.docx
+++ b/docs/Benutzerhandbuch-kv-brain.docx
@@ -1136,6 +1136,117 @@
         <w:t xml:space="preserve"/>
       </w:r>
     </w:p>
+    <w:p>
+      <w:pPr>
+        <w:pStyle w:val="Heading2"/>
+        <w:spacing w:after="100" w:before="260"/>
+      </w:pPr>
+      <w:r>
+        <w:rPr>
+          <w:rFonts w:ascii="Arial" w:cs="Arial" w:eastAsia="Arial" w:hAnsi="Arial"/>
+          <w:b/>
+          <w:bCs/>
+          <w:color w:val="333333"/>
+          <w:sz w:val="24"/>
+          <w:szCs w:val="24"/>
+        </w:rPr>
+        <w:t xml:space="preserve">2.1  Architekturschema</w:t>
+      </w:r>
+    </w:p>
+    <w:p>
+      <w:pPr>
+        <w:spacing w:after="70" w:before="70"/>
+      </w:pPr>
+      <w:r>
+        <w:rPr>
+          <w:rFonts w:ascii="Arial" w:cs="Arial" w:eastAsia="Arial" w:hAnsi="Arial"/>
+          <w:color w:val="333333"/>
+          <w:sz w:val="20"/>
+          <w:szCs w:val="20"/>
+        </w:rPr>
+        <w:t xml:space="preserve">Das Schema zeigt den Aufbau von oben (Zugriff per Browser) nach unten (Daten und KI). Grün gestrichelt ist die On-Premise-Grenze: Alles darin läuft lokal auf dem DGX Spark. Orange gestrichelt und außerhalb dieser Grenze sind die optionalen externen Systeme (Cloud-Modelle und das ELO-Bestandssystem).</w:t>
+      </w:r>
+    </w:p>
+    <w:p>
+      <w:pPr>
+        <w:spacing w:after="40" w:before="80"/>
+        <w:jc w:val="center"/>
+      </w:pPr>
+      <w:r>
+        <w:drawing>
+          <wp:inline distT="0" distB="0" distL="0" distR="0">
+            <wp:extent cx="6096000" cy="3829050"/>
+            <wp:effectExtent t="0" r="0" b="0" l="0"/>
+            <wp:docPr id="1" name="architecture" descr="Schichten von Browser über Caddy, Open WebUI, API-Gateway, Keycloak, RAG-/LLM-/Connector-Diensten bis PostgreSQL, MinIO und Ollama; externe Modelle und ELO-DMS außerhalb der On-Premise-Grenze." title="Architekturschema kv-brain"/>
+            <wp:cNvGraphicFramePr>
+              <a:graphicFrameLocks xmlns:a="http://schemas.openxmlformats.org/drawingml/2006/main" noChangeAspect="1"/>
+            </wp:cNvGraphicFramePr>
+            <a:graphic xmlns:a="http://schemas.openxmlformats.org/drawingml/2006/main">
+              <a:graphicData uri="http://schemas.openxmlformats.org/drawingml/2006/picture">
+                <pic:pic xmlns:pic="http://schemas.openxmlformats.org/drawingml/2006/picture">
+                  <pic:nvPicPr>
+                    <pic:cNvPr id="0" name="" descr=""/>
+                    <pic:cNvPicPr>
+                      <a:picLocks noChangeAspect="1" noChangeArrowheads="1"/>
+                    </pic:cNvPicPr>
+                  </pic:nvPicPr>
+                  <pic:blipFill>
+                    <a:blip r:embed="rId9" cstate="none"/>
+                    <a:srcRect/>
+                    <a:stretch>
+                      <a:fillRect/>
+                    </a:stretch>
+                  </pic:blipFill>
+                  <pic:spPr bwMode="auto">
+                    <a:xfrm>
+                      <a:off x="0" y="0"/>
+                      <a:ext cx="6096000" cy="3829050"/>
+                    </a:xfrm>
+                    <a:prstGeom prst="rect">
+                      <a:avLst/>
+                    </a:prstGeom>
+                  </pic:spPr>
+                </pic:pic>
+              </a:graphicData>
+            </a:graphic>
+          </wp:inline>
+        </w:drawing>
+      </w:r>
+    </w:p>
+    <w:p>
+      <w:pPr>
+        <w:spacing w:after="120"/>
+        <w:jc w:val="center"/>
+      </w:pPr>
+      <w:r>
+        <w:rPr>
+          <w:rFonts w:ascii="Arial" w:cs="Arial" w:eastAsia="Arial" w:hAnsi="Arial"/>
+          <w:i/>
+          <w:iCs/>
+          <w:color w:val="666666"/>
+          <w:sz w:val="16"/>
+          <w:szCs w:val="16"/>
+        </w:rPr>
+        <w:t xml:space="preserve">Abbildung 1: Systemarchitektur der kv-brain-Plattform</w:t>
+      </w:r>
+    </w:p>
+    <w:p>
+      <w:pPr>
+        <w:pStyle w:val="Heading2"/>
+        <w:spacing w:after="100" w:before="260"/>
+      </w:pPr>
+      <w:r>
+        <w:rPr>
+          <w:rFonts w:ascii="Arial" w:cs="Arial" w:eastAsia="Arial" w:hAnsi="Arial"/>
+          <w:b/>
+          <w:bCs/>
+          <w:color w:val="333333"/>
+          <w:sz w:val="24"/>
+          <w:szCs w:val="24"/>
+        </w:rPr>
+        <w:t xml:space="preserve">2.2  Komponenten</w:t>
+      </w:r>
+    </w:p>
     <w:tbl>
       <w:tblPr>
         <w:tblW w:type="dxa" w:w="9638"/>
@@ -1820,6 +1931,164 @@
         </w:tc>
       </w:tr>
     </w:tbl>
+    <w:p>
+      <w:pPr>
+        <w:spacing w:after="40" w:before="60"/>
+      </w:pPr>
+      <w:r>
+        <w:t xml:space="preserve"/>
+      </w:r>
+    </w:p>
+    <w:p>
+      <w:pPr>
+        <w:pStyle w:val="Heading2"/>
+        <w:spacing w:after="100" w:before="260"/>
+      </w:pPr>
+      <w:r>
+        <w:rPr>
+          <w:rFonts w:ascii="Arial" w:cs="Arial" w:eastAsia="Arial" w:hAnsi="Arial"/>
+          <w:b/>
+          <w:bCs/>
+          <w:color w:val="333333"/>
+          <w:sz w:val="24"/>
+          <w:szCs w:val="24"/>
+        </w:rPr>
+        <w:t xml:space="preserve">2.3  Ablauf einer Anfrage</w:t>
+      </w:r>
+    </w:p>
+    <w:p>
+      <w:pPr>
+        <w:pStyle w:val="ListParagraph"/>
+        <w:numPr>
+          <w:ilvl w:val="0"/>
+          <w:numId w:val="3"/>
+        </w:numPr>
+        <w:spacing w:after="40" w:before="40"/>
+      </w:pPr>
+      <w:r>
+        <w:rPr>
+          <w:rFonts w:ascii="Arial" w:cs="Arial" w:eastAsia="Arial" w:hAnsi="Arial"/>
+          <w:color w:val="333333"/>
+          <w:sz w:val="20"/>
+          <w:szCs w:val="20"/>
+        </w:rPr>
+        <w:t xml:space="preserve">Anmeldung: Der Browser meldet sich über Keycloak an (SSO) und erhält ein Token mit Rollen und Mandant (tenant_id).</w:t>
+      </w:r>
+    </w:p>
+    <w:p>
+      <w:pPr>
+        <w:pStyle w:val="ListParagraph"/>
+        <w:numPr>
+          <w:ilvl w:val="0"/>
+          <w:numId w:val="3"/>
+        </w:numPr>
+        <w:spacing w:after="40" w:before="40"/>
+      </w:pPr>
+      <w:r>
+        <w:rPr>
+          <w:rFonts w:ascii="Arial" w:cs="Arial" w:eastAsia="Arial" w:hAnsi="Arial"/>
+          <w:color w:val="333333"/>
+          <w:sz w:val="20"/>
+          <w:szCs w:val="20"/>
+        </w:rPr>
+        <w:t xml:space="preserve">Anfrage: Die Frage geht über Caddy an Open WebUI; die passende Pipe reicht das Token an das API-Gateway weiter.</w:t>
+      </w:r>
+    </w:p>
+    <w:p>
+      <w:pPr>
+        <w:pStyle w:val="ListParagraph"/>
+        <w:numPr>
+          <w:ilvl w:val="0"/>
+          <w:numId w:val="3"/>
+        </w:numPr>
+        <w:spacing w:after="40" w:before="40"/>
+      </w:pPr>
+      <w:r>
+        <w:rPr>
+          <w:rFonts w:ascii="Arial" w:cs="Arial" w:eastAsia="Arial" w:hAnsi="Arial"/>
+          <w:color w:val="333333"/>
+          <w:sz w:val="20"/>
+          <w:szCs w:val="20"/>
+        </w:rPr>
+        <w:t xml:space="preserve">Prüfung: Das API-Gateway prüft das Token, bestimmt tenant_id und Rollen und leitet an den richtigen Dienst.</w:t>
+      </w:r>
+    </w:p>
+    <w:p>
+      <w:pPr>
+        <w:pStyle w:val="ListParagraph"/>
+        <w:numPr>
+          <w:ilvl w:val="0"/>
+          <w:numId w:val="3"/>
+        </w:numPr>
+        <w:spacing w:after="40" w:before="40"/>
+      </w:pPr>
+      <w:r>
+        <w:rPr>
+          <w:rFonts w:ascii="Arial" w:cs="Arial" w:eastAsia="Arial" w:hAnsi="Arial"/>
+          <w:color w:val="333333"/>
+          <w:sz w:val="20"/>
+          <w:szCs w:val="20"/>
+        </w:rPr>
+        <w:t xml:space="preserve">Wissensbasis: Der RAG-Service sucht rechtegeprüft in PostgreSQL/pgvector, holt die Texte und lässt Ollama (lokal) eine Antwort mit Quellen formulieren.</w:t>
+      </w:r>
+    </w:p>
+    <w:p>
+      <w:pPr>
+        <w:pStyle w:val="ListParagraph"/>
+        <w:numPr>
+          <w:ilvl w:val="0"/>
+          <w:numId w:val="3"/>
+        </w:numPr>
+        <w:spacing w:after="40" w:before="40"/>
+      </w:pPr>
+      <w:r>
+        <w:rPr>
+          <w:rFonts w:ascii="Arial" w:cs="Arial" w:eastAsia="Arial" w:hAnsi="Arial"/>
+          <w:color w:val="333333"/>
+          <w:sz w:val="20"/>
+          <w:szCs w:val="20"/>
+        </w:rPr>
+        <w:t xml:space="preserve">Externe Modelle (nur falls freigegeben): Der LLM-Service leitet die Anfrage an OpenAI/Anthropic — in der Antwort klar als extern gekennzeichnet.</w:t>
+      </w:r>
+    </w:p>
+    <w:p>
+      <w:pPr>
+        <w:pStyle w:val="ListParagraph"/>
+        <w:numPr>
+          <w:ilvl w:val="0"/>
+          <w:numId w:val="3"/>
+        </w:numPr>
+        <w:spacing w:after="40" w:before="40"/>
+      </w:pPr>
+      <w:r>
+        <w:rPr>
+          <w:rFonts w:ascii="Arial" w:cs="Arial" w:eastAsia="Arial" w:hAnsi="Arial"/>
+          <w:color w:val="333333"/>
+          <w:sz w:val="20"/>
+          <w:szCs w:val="20"/>
+        </w:rPr>
+        <w:t xml:space="preserve">Dokumentensystem: Der ELO-Connector fragt das ELO-DMS lesend ab; Ollama formuliert die Antwort.</w:t>
+      </w:r>
+    </w:p>
+    <w:p>
+      <w:pPr>
+        <w:pStyle w:val="ListParagraph"/>
+        <w:numPr>
+          <w:ilvl w:val="0"/>
+          <w:numId w:val="3"/>
+        </w:numPr>
+        <w:spacing w:after="40" w:before="40"/>
+      </w:pPr>
+      <w:r>
+        <w:rPr>
+          <w:rFonts w:ascii="Arial" w:cs="Arial" w:eastAsia="Arial" w:hAnsi="Arial"/>
+          <w:color w:val="333333"/>
+          <w:sz w:val="20"/>
+          <w:szCs w:val="20"/>
+        </w:rPr>
+        <w:t xml:space="preserve">Rückweg: Die Antwort fließt denselben Weg zurück in den Browser.</w:t>
+      </w:r>
+    </w:p>
     <w:p>
       <w:pPr>
         <w:spacing w:after="40" w:before="60"/>

</xml_diff>

<commit_message>
docs: Benutzerhandbuch fuer aktualisierte white-label-Variante
Ergaenzt: Modell-Tabelle mit Installiert-/Antwortmodell-Spalten (6.1),
Modell einrichten installieren/aktivieren/als-Standard + 'nur ein LLM' +
'drei Dinge muessen passen' (6.2), Wissensdatenbank loeschen (4.1),
Eigenes Logo (8.2), automatischer Host-Sync bei IP-Wechsel (15.1/15.2).

Co-Authored-By: Claude Fable 5 <noreply@anthropic.com>
</commit_message>
<xml_diff>
--- a/docs/Benutzerhandbuch-kv-brain.docx
+++ b/docs/Benutzerhandbuch-kv-brain.docx
@@ -3463,7 +3463,40 @@
           <w:sz w:val="20"/>
           <w:szCs w:val="20"/>
         </w:rPr>
+        <w:t xml:space="preserve">Über Umbenennen ändern Sie den Namen; über Löschen entfernen Sie eine Wissensdatenbank.</w:t>
+      </w:r>
+    </w:p>
+    <w:p>
+      <w:pPr>
+        <w:pStyle w:val="ListParagraph"/>
+        <w:numPr>
+          <w:ilvl w:val="0"/>
+          <w:numId w:val="2"/>
+        </w:numPr>
+        <w:spacing w:after="30" w:before="30"/>
+      </w:pPr>
+      <w:r>
+        <w:rPr>
+          <w:rFonts w:ascii="Arial" w:cs="Arial" w:eastAsia="Arial" w:hAnsi="Arial"/>
+          <w:color w:val="333333"/>
+          <w:sz w:val="20"/>
+          <w:szCs w:val="20"/>
+        </w:rPr>
         <w:t xml:space="preserve">Eine Person sieht und durchsucht nur Wissensdatenbanken, für die ihre Gruppe freigeschaltet ist.</w:t>
+      </w:r>
+    </w:p>
+    <w:p>
+      <w:pPr>
+        <w:spacing w:after="70" w:before="70"/>
+      </w:pPr>
+      <w:r>
+        <w:rPr>
+          <w:rFonts w:ascii="Arial" w:cs="Arial" w:eastAsia="Arial" w:hAnsi="Arial"/>
+          <w:color w:val="333333"/>
+          <w:sz w:val="20"/>
+          <w:szCs w:val="20"/>
+        </w:rPr>
+        <w:t xml:space="preserve">Gelöscht werden kann nur eine LEERE Wissensdatenbank — enthält sie noch Dokumente, verschieben oder löschen Sie diese zuerst (Schutz vor versehentlichem Datenverlust). Die Sammelablage „Allgemein" lässt sich nicht löschen.</w:t>
       </w:r>
     </w:p>
     <w:p>
@@ -4032,17 +4065,12 @@
           <w:sz w:val="24"/>
           <w:szCs w:val="24"/>
         </w:rPr>
-        <w:t xml:space="preserve">6.1  Modell-Katalog (Tab Einstellungen)</w:t>
-      </w:r>
-    </w:p>
-    <w:p>
-      <w:pPr>
-        <w:pStyle w:val="ListParagraph"/>
-        <w:numPr>
-          <w:ilvl w:val="0"/>
-          <w:numId w:val="2"/>
-        </w:numPr>
-        <w:spacing w:after="30" w:before="30"/>
+        <w:t xml:space="preserve">6.1  Die Modell-Tabelle (Tab Einstellungen → KI-Modelle)</w:t>
+      </w:r>
+    </w:p>
+    <w:p>
+      <w:pPr>
+        <w:spacing w:after="70" w:before="70"/>
       </w:pPr>
       <w:r>
         <w:rPr>
@@ -4051,17 +4079,421 @@
           <w:sz w:val="20"/>
           <w:szCs w:val="20"/>
         </w:rPr>
-        <w:t xml:space="preserve">Aktiv: schaltet ein Modell grundsätzlich nutzbar.</w:t>
-      </w:r>
-    </w:p>
-    <w:p>
-      <w:pPr>
-        <w:pStyle w:val="ListParagraph"/>
-        <w:numPr>
-          <w:ilvl w:val="0"/>
-          <w:numId w:val="2"/>
-        </w:numPr>
-        <w:spacing w:after="30" w:before="30"/>
+        <w:t xml:space="preserve">Die Tabelle zeigt je Modell fünf Spalten:</w:t>
+      </w:r>
+    </w:p>
+    <w:tbl>
+      <w:tblPr>
+        <w:tblW w:type="dxa" w:w="9638"/>
+        <w:tblBorders>
+          <w:top w:val="single" w:color="auto" w:sz="4"/>
+          <w:left w:val="single" w:color="auto" w:sz="4"/>
+          <w:bottom w:val="single" w:color="auto" w:sz="4"/>
+          <w:right w:val="single" w:color="auto" w:sz="4"/>
+          <w:insideH w:val="single" w:color="auto" w:sz="4"/>
+          <w:insideV w:val="single" w:color="auto" w:sz="4"/>
+        </w:tblBorders>
+      </w:tblPr>
+      <w:tblGrid>
+        <w:gridCol w:w="2600"/>
+        <w:gridCol w:w="7038"/>
+      </w:tblGrid>
+      <w:tr>
+        <w:trPr>
+          <w:tblHeader/>
+        </w:trPr>
+        <w:tc>
+          <w:tcPr>
+            <w:tcW w:type="dxa" w:w="2600"/>
+            <w:tcBorders>
+              <w:top w:val="single" w:color="CCCCCC" w:sz="1"/>
+              <w:left w:val="single" w:color="CCCCCC" w:sz="1"/>
+              <w:bottom w:val="single" w:color="CCCCCC" w:sz="1"/>
+              <w:right w:val="single" w:color="CCCCCC" w:sz="1"/>
+            </w:tcBorders>
+            <w:shd w:fill="235FA6" w:val="clear"/>
+            <w:tcMar>
+              <w:top w:type="dxa" w:w="70"/>
+              <w:left w:type="dxa" w:w="110"/>
+              <w:bottom w:type="dxa" w:w="70"/>
+              <w:right w:type="dxa" w:w="110"/>
+            </w:tcMar>
+          </w:tcPr>
+          <w:p>
+            <w:r>
+              <w:rPr>
+                <w:rFonts w:ascii="Arial" w:cs="Arial" w:eastAsia="Arial" w:hAnsi="Arial"/>
+                <w:b/>
+                <w:bCs/>
+                <w:color w:val="FFFFFF"/>
+                <w:sz w:val="19"/>
+                <w:szCs w:val="19"/>
+              </w:rPr>
+              <w:t xml:space="preserve">Spalte</w:t>
+            </w:r>
+          </w:p>
+        </w:tc>
+        <w:tc>
+          <w:tcPr>
+            <w:tcW w:type="dxa" w:w="7038"/>
+            <w:tcBorders>
+              <w:top w:val="single" w:color="CCCCCC" w:sz="1"/>
+              <w:left w:val="single" w:color="CCCCCC" w:sz="1"/>
+              <w:bottom w:val="single" w:color="CCCCCC" w:sz="1"/>
+              <w:right w:val="single" w:color="CCCCCC" w:sz="1"/>
+            </w:tcBorders>
+            <w:shd w:fill="235FA6" w:val="clear"/>
+            <w:tcMar>
+              <w:top w:type="dxa" w:w="70"/>
+              <w:left w:type="dxa" w:w="110"/>
+              <w:bottom w:type="dxa" w:w="70"/>
+              <w:right w:type="dxa" w:w="110"/>
+            </w:tcMar>
+          </w:tcPr>
+          <w:p>
+            <w:r>
+              <w:rPr>
+                <w:rFonts w:ascii="Arial" w:cs="Arial" w:eastAsia="Arial" w:hAnsi="Arial"/>
+                <w:b/>
+                <w:bCs/>
+                <w:color w:val="FFFFFF"/>
+                <w:sz w:val="19"/>
+                <w:szCs w:val="19"/>
+              </w:rPr>
+              <w:t xml:space="preserve">Bedeutung</w:t>
+            </w:r>
+          </w:p>
+        </w:tc>
+      </w:tr>
+      <w:tr>
+        <w:tc>
+          <w:tcPr>
+            <w:tcW w:type="dxa" w:w="2600"/>
+            <w:tcBorders>
+              <w:top w:val="single" w:color="CCCCCC" w:sz="1"/>
+              <w:left w:val="single" w:color="CCCCCC" w:sz="1"/>
+              <w:bottom w:val="single" w:color="CCCCCC" w:sz="1"/>
+              <w:right w:val="single" w:color="CCCCCC" w:sz="1"/>
+            </w:tcBorders>
+            <w:shd w:fill="FFFFFF" w:val="clear"/>
+            <w:tcMar>
+              <w:top w:type="dxa" w:w="70"/>
+              <w:left w:type="dxa" w:w="110"/>
+              <w:bottom w:type="dxa" w:w="70"/>
+              <w:right w:type="dxa" w:w="110"/>
+            </w:tcMar>
+          </w:tcPr>
+          <w:p>
+            <w:r>
+              <w:rPr>
+                <w:rFonts w:ascii="Arial" w:cs="Arial" w:eastAsia="Arial" w:hAnsi="Arial"/>
+                <w:color w:val="333333"/>
+                <w:sz w:val="19"/>
+                <w:szCs w:val="19"/>
+              </w:rPr>
+              <w:t xml:space="preserve">Anbieter</w:t>
+            </w:r>
+          </w:p>
+        </w:tc>
+        <w:tc>
+          <w:tcPr>
+            <w:tcW w:type="dxa" w:w="7038"/>
+            <w:tcBorders>
+              <w:top w:val="single" w:color="CCCCCC" w:sz="1"/>
+              <w:left w:val="single" w:color="CCCCCC" w:sz="1"/>
+              <w:bottom w:val="single" w:color="CCCCCC" w:sz="1"/>
+              <w:right w:val="single" w:color="CCCCCC" w:sz="1"/>
+            </w:tcBorders>
+            <w:shd w:fill="FFFFFF" w:val="clear"/>
+            <w:tcMar>
+              <w:top w:type="dxa" w:w="70"/>
+              <w:left w:type="dxa" w:w="110"/>
+              <w:bottom w:type="dxa" w:w="70"/>
+              <w:right w:type="dxa" w:w="110"/>
+            </w:tcMar>
+          </w:tcPr>
+          <w:p>
+            <w:r>
+              <w:rPr>
+                <w:rFonts w:ascii="Arial" w:cs="Arial" w:eastAsia="Arial" w:hAnsi="Arial"/>
+                <w:color w:val="333333"/>
+                <w:sz w:val="19"/>
+                <w:szCs w:val="19"/>
+              </w:rPr>
+              <w:t xml:space="preserve">lokal (läuft auf dem Server) oder extern (OpenAI/Anthropic)</w:t>
+            </w:r>
+          </w:p>
+        </w:tc>
+      </w:tr>
+      <w:tr>
+        <w:tc>
+          <w:tcPr>
+            <w:tcW w:type="dxa" w:w="2600"/>
+            <w:tcBorders>
+              <w:top w:val="single" w:color="CCCCCC" w:sz="1"/>
+              <w:left w:val="single" w:color="CCCCCC" w:sz="1"/>
+              <w:bottom w:val="single" w:color="CCCCCC" w:sz="1"/>
+              <w:right w:val="single" w:color="CCCCCC" w:sz="1"/>
+            </w:tcBorders>
+            <w:shd w:fill="F5F5F5" w:val="clear"/>
+            <w:tcMar>
+              <w:top w:type="dxa" w:w="70"/>
+              <w:left w:type="dxa" w:w="110"/>
+              <w:bottom w:type="dxa" w:w="70"/>
+              <w:right w:type="dxa" w:w="110"/>
+            </w:tcMar>
+          </w:tcPr>
+          <w:p>
+            <w:r>
+              <w:rPr>
+                <w:rFonts w:ascii="Arial" w:cs="Arial" w:eastAsia="Arial" w:hAnsi="Arial"/>
+                <w:color w:val="333333"/>
+                <w:sz w:val="19"/>
+                <w:szCs w:val="19"/>
+              </w:rPr>
+              <w:t xml:space="preserve">Installiert</w:t>
+            </w:r>
+          </w:p>
+        </w:tc>
+        <w:tc>
+          <w:tcPr>
+            <w:tcW w:type="dxa" w:w="7038"/>
+            <w:tcBorders>
+              <w:top w:val="single" w:color="CCCCCC" w:sz="1"/>
+              <w:left w:val="single" w:color="CCCCCC" w:sz="1"/>
+              <w:bottom w:val="single" w:color="CCCCCC" w:sz="1"/>
+              <w:right w:val="single" w:color="CCCCCC" w:sz="1"/>
+            </w:tcBorders>
+            <w:shd w:fill="F5F5F5" w:val="clear"/>
+            <w:tcMar>
+              <w:top w:type="dxa" w:w="70"/>
+              <w:left w:type="dxa" w:w="110"/>
+              <w:bottom w:type="dxa" w:w="70"/>
+              <w:right w:type="dxa" w:w="110"/>
+            </w:tcMar>
+          </w:tcPr>
+          <w:p>
+            <w:r>
+              <w:rPr>
+                <w:rFonts w:ascii="Arial" w:cs="Arial" w:eastAsia="Arial" w:hAnsi="Arial"/>
+                <w:color w:val="333333"/>
+                <w:sz w:val="19"/>
+                <w:szCs w:val="19"/>
+              </w:rPr>
+              <w:t xml:space="preserve">✓ installiert = liegt in Ollama; sonst Schaltfläche ⬇ Installieren</w:t>
+            </w:r>
+          </w:p>
+        </w:tc>
+      </w:tr>
+      <w:tr>
+        <w:tc>
+          <w:tcPr>
+            <w:tcW w:type="dxa" w:w="2600"/>
+            <w:tcBorders>
+              <w:top w:val="single" w:color="CCCCCC" w:sz="1"/>
+              <w:left w:val="single" w:color="CCCCCC" w:sz="1"/>
+              <w:bottom w:val="single" w:color="CCCCCC" w:sz="1"/>
+              <w:right w:val="single" w:color="CCCCCC" w:sz="1"/>
+            </w:tcBorders>
+            <w:shd w:fill="FFFFFF" w:val="clear"/>
+            <w:tcMar>
+              <w:top w:type="dxa" w:w="70"/>
+              <w:left w:type="dxa" w:w="110"/>
+              <w:bottom w:type="dxa" w:w="70"/>
+              <w:right w:type="dxa" w:w="110"/>
+            </w:tcMar>
+          </w:tcPr>
+          <w:p>
+            <w:r>
+              <w:rPr>
+                <w:rFonts w:ascii="Arial" w:cs="Arial" w:eastAsia="Arial" w:hAnsi="Arial"/>
+                <w:color w:val="333333"/>
+                <w:sz w:val="19"/>
+                <w:szCs w:val="19"/>
+              </w:rPr>
+              <w:t xml:space="preserve">Aktiv</w:t>
+            </w:r>
+          </w:p>
+        </w:tc>
+        <w:tc>
+          <w:tcPr>
+            <w:tcW w:type="dxa" w:w="7038"/>
+            <w:tcBorders>
+              <w:top w:val="single" w:color="CCCCCC" w:sz="1"/>
+              <w:left w:val="single" w:color="CCCCCC" w:sz="1"/>
+              <w:bottom w:val="single" w:color="CCCCCC" w:sz="1"/>
+              <w:right w:val="single" w:color="CCCCCC" w:sz="1"/>
+            </w:tcBorders>
+            <w:shd w:fill="FFFFFF" w:val="clear"/>
+            <w:tcMar>
+              <w:top w:type="dxa" w:w="70"/>
+              <w:left w:type="dxa" w:w="110"/>
+              <w:bottom w:type="dxa" w:w="70"/>
+              <w:right w:type="dxa" w:w="110"/>
+            </w:tcMar>
+          </w:tcPr>
+          <w:p>
+            <w:r>
+              <w:rPr>
+                <w:rFonts w:ascii="Arial" w:cs="Arial" w:eastAsia="Arial" w:hAnsi="Arial"/>
+                <w:color w:val="333333"/>
+                <w:sz w:val="19"/>
+                <w:szCs w:val="19"/>
+              </w:rPr>
+              <w:t xml:space="preserve">Modell grundsätzlich nutzbar (bei nicht installierten Modellen gesperrt)</w:t>
+            </w:r>
+          </w:p>
+        </w:tc>
+      </w:tr>
+      <w:tr>
+        <w:tc>
+          <w:tcPr>
+            <w:tcW w:type="dxa" w:w="2600"/>
+            <w:tcBorders>
+              <w:top w:val="single" w:color="CCCCCC" w:sz="1"/>
+              <w:left w:val="single" w:color="CCCCCC" w:sz="1"/>
+              <w:bottom w:val="single" w:color="CCCCCC" w:sz="1"/>
+              <w:right w:val="single" w:color="CCCCCC" w:sz="1"/>
+            </w:tcBorders>
+            <w:shd w:fill="F5F5F5" w:val="clear"/>
+            <w:tcMar>
+              <w:top w:type="dxa" w:w="70"/>
+              <w:left w:type="dxa" w:w="110"/>
+              <w:bottom w:type="dxa" w:w="70"/>
+              <w:right w:type="dxa" w:w="110"/>
+            </w:tcMar>
+          </w:tcPr>
+          <w:p>
+            <w:r>
+              <w:rPr>
+                <w:rFonts w:ascii="Arial" w:cs="Arial" w:eastAsia="Arial" w:hAnsi="Arial"/>
+                <w:color w:val="333333"/>
+                <w:sz w:val="19"/>
+                <w:szCs w:val="19"/>
+              </w:rPr>
+              <w:t xml:space="preserve">Für alle Nutzer</w:t>
+            </w:r>
+          </w:p>
+        </w:tc>
+        <w:tc>
+          <w:tcPr>
+            <w:tcW w:type="dxa" w:w="7038"/>
+            <w:tcBorders>
+              <w:top w:val="single" w:color="CCCCCC" w:sz="1"/>
+              <w:left w:val="single" w:color="CCCCCC" w:sz="1"/>
+              <w:bottom w:val="single" w:color="CCCCCC" w:sz="1"/>
+              <w:right w:val="single" w:color="CCCCCC" w:sz="1"/>
+            </w:tcBorders>
+            <w:shd w:fill="F5F5F5" w:val="clear"/>
+            <w:tcMar>
+              <w:top w:type="dxa" w:w="70"/>
+              <w:left w:type="dxa" w:w="110"/>
+              <w:bottom w:type="dxa" w:w="70"/>
+              <w:right w:type="dxa" w:w="110"/>
+            </w:tcMar>
+          </w:tcPr>
+          <w:p>
+            <w:r>
+              <w:rPr>
+                <w:rFonts w:ascii="Arial" w:cs="Arial" w:eastAsia="Arial" w:hAnsi="Arial"/>
+                <w:color w:val="333333"/>
+                <w:sz w:val="19"/>
+                <w:szCs w:val="19"/>
+              </w:rPr>
+              <w:t xml:space="preserve">aktives Modell für alle freigeben (sonst nur individuell pro Nutzer)</w:t>
+            </w:r>
+          </w:p>
+        </w:tc>
+      </w:tr>
+      <w:tr>
+        <w:tc>
+          <w:tcPr>
+            <w:tcW w:type="dxa" w:w="2600"/>
+            <w:tcBorders>
+              <w:top w:val="single" w:color="CCCCCC" w:sz="1"/>
+              <w:left w:val="single" w:color="CCCCCC" w:sz="1"/>
+              <w:bottom w:val="single" w:color="CCCCCC" w:sz="1"/>
+              <w:right w:val="single" w:color="CCCCCC" w:sz="1"/>
+            </w:tcBorders>
+            <w:shd w:fill="FFFFFF" w:val="clear"/>
+            <w:tcMar>
+              <w:top w:type="dxa" w:w="70"/>
+              <w:left w:type="dxa" w:w="110"/>
+              <w:bottom w:type="dxa" w:w="70"/>
+              <w:right w:type="dxa" w:w="110"/>
+            </w:tcMar>
+          </w:tcPr>
+          <w:p>
+            <w:r>
+              <w:rPr>
+                <w:rFonts w:ascii="Arial" w:cs="Arial" w:eastAsia="Arial" w:hAnsi="Arial"/>
+                <w:color w:val="333333"/>
+                <w:sz w:val="19"/>
+                <w:szCs w:val="19"/>
+              </w:rPr>
+              <w:t xml:space="preserve">Antwortmodell</w:t>
+            </w:r>
+          </w:p>
+        </w:tc>
+        <w:tc>
+          <w:tcPr>
+            <w:tcW w:type="dxa" w:w="7038"/>
+            <w:tcBorders>
+              <w:top w:val="single" w:color="CCCCCC" w:sz="1"/>
+              <w:left w:val="single" w:color="CCCCCC" w:sz="1"/>
+              <w:bottom w:val="single" w:color="CCCCCC" w:sz="1"/>
+              <w:right w:val="single" w:color="CCCCCC" w:sz="1"/>
+            </w:tcBorders>
+            <w:shd w:fill="FFFFFF" w:val="clear"/>
+            <w:tcMar>
+              <w:top w:type="dxa" w:w="70"/>
+              <w:left w:type="dxa" w:w="110"/>
+              <w:bottom w:type="dxa" w:w="70"/>
+              <w:right w:type="dxa" w:w="110"/>
+            </w:tcMar>
+          </w:tcPr>
+          <w:p>
+            <w:r>
+              <w:rPr>
+                <w:rFonts w:ascii="Arial" w:cs="Arial" w:eastAsia="Arial" w:hAnsi="Arial"/>
+                <w:color w:val="333333"/>
+                <w:sz w:val="19"/>
+                <w:szCs w:val="19"/>
+              </w:rPr>
+              <w:t xml:space="preserve">★ Standard = dieses Modell beantwortet Chat und Wissensbasis; per „Als Standard" umschaltbar</w:t>
+            </w:r>
+          </w:p>
+        </w:tc>
+      </w:tr>
+    </w:tbl>
+    <w:p>
+      <w:pPr>
+        <w:spacing w:after="40" w:before="40"/>
+      </w:pPr>
+      <w:r>
+        <w:t xml:space="preserve"/>
+      </w:r>
+    </w:p>
+    <w:p>
+      <w:pPr>
+        <w:pStyle w:val="Heading2"/>
+        <w:spacing w:after="100" w:before="260"/>
+      </w:pPr>
+      <w:r>
+        <w:rPr>
+          <w:rFonts w:ascii="Arial" w:cs="Arial" w:eastAsia="Arial" w:hAnsi="Arial"/>
+          <w:b/>
+          <w:bCs/>
+          <w:color w:val="333333"/>
+          <w:sz w:val="24"/>
+          <w:szCs w:val="24"/>
+        </w:rPr>
+        <w:t xml:space="preserve">6.2  Ein Modell einrichten — installieren, aktivieren, als Standard</w:t>
+      </w:r>
+    </w:p>
+    <w:p>
+      <w:pPr>
+        <w:spacing w:after="70" w:before="70"/>
       </w:pPr>
       <w:r>
         <w:rPr>
@@ -4070,65 +4502,7 @@
           <w:sz w:val="20"/>
           <w:szCs w:val="20"/>
         </w:rPr>
-        <w:t xml:space="preserve">Für alle Nutzer: gibt ein aktives Modell für alle frei (sonst nur individuell pro Nutzer).</w:t>
-      </w:r>
-    </w:p>
-    <w:p>
-      <w:pPr>
-        <w:pStyle w:val="ListParagraph"/>
-        <w:numPr>
-          <w:ilvl w:val="0"/>
-          <w:numId w:val="2"/>
-        </w:numPr>
-        <w:spacing w:after="30" w:before="30"/>
-      </w:pPr>
-      <w:r>
-        <w:rPr>
-          <w:rFonts w:ascii="Arial" w:cs="Arial" w:eastAsia="Arial" w:hAnsi="Arial"/>
-          <w:color w:val="333333"/>
-          <w:sz w:val="20"/>
-          <w:szCs w:val="20"/>
-        </w:rPr>
-        <w:t xml:space="preserve">Das lokale Modell (Qwen3 32B) ist standardmäßig aktiv und für alle freigegeben.</w:t>
-      </w:r>
-    </w:p>
-    <w:p>
-      <w:pPr>
-        <w:spacing w:after="40" w:before="40"/>
-      </w:pPr>
-      <w:r>
-        <w:t xml:space="preserve"/>
-      </w:r>
-    </w:p>
-    <w:p>
-      <w:pPr>
-        <w:pStyle w:val="Heading2"/>
-        <w:spacing w:after="100" w:before="260"/>
-      </w:pPr>
-      <w:r>
-        <w:rPr>
-          <w:rFonts w:ascii="Arial" w:cs="Arial" w:eastAsia="Arial" w:hAnsi="Arial"/>
-          <w:b/>
-          <w:bCs/>
-          <w:color w:val="333333"/>
-          <w:sz w:val="24"/>
-          <w:szCs w:val="24"/>
-        </w:rPr>
-        <w:t xml:space="preserve">6.2  Lokales Modell herunterladen</w:t>
-      </w:r>
-    </w:p>
-    <w:p>
-      <w:pPr>
-        <w:spacing w:after="70" w:before="70"/>
-      </w:pPr>
-      <w:r>
-        <w:rPr>
-          <w:rFonts w:ascii="Arial" w:cs="Arial" w:eastAsia="Arial" w:hAnsi="Arial"/>
-          <w:color w:val="333333"/>
-          <w:sz w:val="20"/>
-          <w:szCs w:val="20"/>
-        </w:rPr>
-        <w:t xml:space="preserve">Unter Lokales Modell herunterladen kann ein weiteres Ollama-Modell auf den Server geladen werden.</w:t>
+        <w:t xml:space="preserve">Der komplette Modellwechsel ist im Verwaltungs-UI klickbar, ohne Kommandozeile:</w:t>
       </w:r>
     </w:p>
     <w:p>
@@ -4147,7 +4521,7 @@
           <w:sz w:val="20"/>
           <w:szCs w:val="20"/>
         </w:rPr>
-        <w:t xml:space="preserve">Modellnamen eintragen (z.B. qwen3:14b, gemma3, llama3.3) — Namen siehe ollama.com/library</w:t>
+        <w:t xml:space="preserve">⬇ Installieren in der Modellzeile (oder unter „Lokales Modell herunterladen" einen beliebigen Namen von ollama.com/library eintragen). Der Download läuft mit Fortschritt; große Modelle dauern einige Minuten.</w:t>
       </w:r>
     </w:p>
     <w:p>
@@ -4166,7 +4540,7 @@
           <w:sz w:val="20"/>
           <w:szCs w:val="20"/>
         </w:rPr>
-        <w:t xml:space="preserve">Herunterladen klicken; der Fortschritt wird angezeigt (große Modelle dauern einige Minuten)</w:t>
+        <w:t xml:space="preserve">Nach „✓ installiert" das Häkchen Aktiv setzen (ggf. Für alle Nutzer).</w:t>
       </w:r>
     </w:p>
     <w:p>
@@ -4185,60 +4559,15 @@
           <w:sz w:val="20"/>
           <w:szCs w:val="20"/>
         </w:rPr>
-        <w:t xml:space="preserve">Nach Abschluss erscheint das Modell oben in der Liste und kann dort aktiviert/freigegeben werden</w:t>
-      </w:r>
-    </w:p>
-    <w:p>
-      <w:pPr>
-        <w:spacing w:after="70" w:before="70"/>
-      </w:pPr>
-      <w:r>
-        <w:rPr>
-          <w:rFonts w:ascii="Arial" w:cs="Arial" w:eastAsia="Arial" w:hAnsi="Arial"/>
-          <w:color w:val="333333"/>
-          <w:sz w:val="20"/>
-          <w:szCs w:val="20"/>
-        </w:rPr>
-        <w:t xml:space="preserve">Neu geladene Modelle sind zunächst deaktiviert — die Freigabe ist ein bewusster Schritt. Es läuft immer nur ein Download gleichzeitig.</w:t>
-      </w:r>
-    </w:p>
-    <w:p>
-      <w:pPr>
-        <w:spacing w:after="40" w:before="40"/>
+        <w:t xml:space="preserve">Als Standard klicken → dieses Modell beantwortet ab sofort Chat und Wissensbasis — ohne Neustart.</w:t>
+      </w:r>
+    </w:p>
+    <w:p>
+      <w:pPr>
+        <w:spacing w:after="30" w:before="30"/>
       </w:pPr>
       <w:r>
         <w:t xml:space="preserve"/>
-      </w:r>
-    </w:p>
-    <w:p>
-      <w:pPr>
-        <w:pStyle w:val="Heading2"/>
-        <w:spacing w:after="100" w:before="260"/>
-      </w:pPr>
-      <w:r>
-        <w:rPr>
-          <w:rFonts w:ascii="Arial" w:cs="Arial" w:eastAsia="Arial" w:hAnsi="Arial"/>
-          <w:b/>
-          <w:bCs/>
-          <w:color w:val="333333"/>
-          <w:sz w:val="24"/>
-          <w:szCs w:val="24"/>
-        </w:rPr>
-        <w:t xml:space="preserve">6.3  Externe Modelle und API-Keys</w:t>
-      </w:r>
-    </w:p>
-    <w:p>
-      <w:pPr>
-        <w:spacing w:after="70" w:before="70"/>
-      </w:pPr>
-      <w:r>
-        <w:rPr>
-          <w:rFonts w:ascii="Arial" w:cs="Arial" w:eastAsia="Arial" w:hAnsi="Arial"/>
-          <w:color w:val="333333"/>
-          <w:sz w:val="20"/>
-          <w:szCs w:val="20"/>
-        </w:rPr>
-        <w:t xml:space="preserve">Externe Modelle (OpenAI/Anthropic) sind standardmäßig deaktiviert. Zur Nutzung werden unter API-Keys die Schlüssel hinterlegt (verschlüsselt gespeichert, nie wieder angezeigt) und das gewünschte Modell aktiviert.</w:t>
       </w:r>
     </w:p>
     <w:tbl>
@@ -4261,12 +4590,12 @@
           <w:tcPr>
             <w:tcW w:type="dxa" w:w="9638"/>
             <w:tcBorders>
-              <w:top w:val="single" w:color="C75B00" w:sz="1"/>
-              <w:left w:val="single" w:color="C75B00" w:sz="14"/>
-              <w:bottom w:val="single" w:color="C75B00" w:sz="1"/>
-              <w:right w:val="single" w:color="C75B00" w:sz="1"/>
-            </w:tcBorders>
-            <w:shd w:fill="FBF0E6" w:val="clear"/>
+              <w:top w:val="single" w:color="235FA6" w:sz="1"/>
+              <w:left w:val="single" w:color="235FA6" w:sz="14"/>
+              <w:bottom w:val="single" w:color="235FA6" w:sz="1"/>
+              <w:right w:val="single" w:color="235FA6" w:sz="1"/>
+            </w:tcBorders>
+            <w:shd w:fill="EAF1FA" w:val="clear"/>
             <w:tcMar>
               <w:top w:type="dxa" w:w="110"/>
               <w:left w:type="dxa" w:w="200"/>
@@ -4283,11 +4612,11 @@
                 <w:rFonts w:ascii="Arial" w:cs="Arial" w:eastAsia="Arial" w:hAnsi="Arial"/>
                 <w:b/>
                 <w:bCs/>
-                <w:color w:val="C75B00"/>
+                <w:color w:val="235FA6"/>
                 <w:sz w:val="20"/>
                 <w:szCs w:val="20"/>
               </w:rPr>
-              <w:t xml:space="preserve">Datenschutz bei externen Modellen</w:t>
+              <w:t xml:space="preserve">Nur ein großes Modell gleichzeitig</w:t>
             </w:r>
           </w:p>
           <w:p>
@@ -4301,7 +4630,7 @@
                 <w:sz w:val="19"/>
                 <w:szCs w:val="19"/>
               </w:rPr>
-              <w:t xml:space="preserve">Externe Modelle übertragen Nutzereingaben an Dritte außerhalb der Plattform.</w:t>
+              <w:t xml:space="preserve">Es ist immer nur EIN großes Sprachmodell geladen (plus das kleine</w:t>
             </w:r>
           </w:p>
           <w:p>
@@ -4315,7 +4644,7 @@
                 <w:sz w:val="19"/>
                 <w:szCs w:val="19"/>
               </w:rPr>
-              <w:t xml:space="preserve">Aktivierung nur nach Freigabe durch den Datenschutzbeauftragten. In jeder</w:t>
+              <w:t xml:space="preserve">Embedding-Modell). Beim Umschalten des Standard-Antwortmodells wird das alte</w:t>
             </w:r>
           </w:p>
           <w:p>
@@ -4329,7 +4658,7 @@
                 <w:sz w:val="19"/>
                 <w:szCs w:val="19"/>
               </w:rPr>
-              <w:t xml:space="preserve">Antwort sind externe Modelle klar als extern gekennzeichnet. Wissensbasis und</w:t>
+              <w:t xml:space="preserve">automatisch aus dem Speicher verdrängt — so bleibt die volle GPU-Leistung</w:t>
             </w:r>
           </w:p>
           <w:p>
@@ -4343,7 +4672,7 @@
                 <w:sz w:val="19"/>
                 <w:szCs w:val="19"/>
               </w:rPr>
-              <w:t xml:space="preserve">ELO nutzen niemals externe Modelle.</w:t>
+              <w:t xml:space="preserve">erhalten und Antworten bleiben flüssig.</w:t>
             </w:r>
           </w:p>
         </w:tc>
@@ -4351,240 +4680,10 @@
     </w:tbl>
     <w:p>
       <w:pPr>
-        <w:pStyle w:val="Heading1"/>
-        <w:pageBreakBefore/>
-      </w:pPr>
-      <w:r>
-        <w:rPr>
-          <w:rFonts w:ascii="Arial" w:cs="Arial" w:eastAsia="Arial" w:hAnsi="Arial"/>
-          <w:b/>
-          <w:bCs/>
-          <w:color w:val="235FA6"/>
-          <w:sz w:val="30"/>
-          <w:szCs w:val="30"/>
-        </w:rPr>
-        <w:t xml:space="preserve">7  Monitoring und E-Mail-Alarm</w:t>
-      </w:r>
-    </w:p>
-    <w:p>
-      <w:pPr>
-        <w:pStyle w:val="Heading2"/>
-        <w:spacing w:after="100" w:before="260"/>
-      </w:pPr>
-      <w:r>
-        <w:rPr>
-          <w:rFonts w:ascii="Arial" w:cs="Arial" w:eastAsia="Arial" w:hAnsi="Arial"/>
-          <w:b/>
-          <w:bCs/>
-          <w:color w:val="333333"/>
-          <w:sz w:val="24"/>
-          <w:szCs w:val="24"/>
-        </w:rPr>
-        <w:t xml:space="preserve">7.1  Systemstatus</w:t>
-      </w:r>
-    </w:p>
-    <w:p>
-      <w:pPr>
-        <w:spacing w:after="70" w:before="70"/>
-      </w:pPr>
-      <w:r>
-        <w:rPr>
-          <w:rFonts w:ascii="Arial" w:cs="Arial" w:eastAsia="Arial" w:hAnsi="Arial"/>
-          <w:color w:val="333333"/>
-          <w:sz w:val="20"/>
-          <w:szCs w:val="20"/>
-        </w:rPr>
-        <w:t xml:space="preserve">Im Tab Einstellungen prüft der Systemstatus alle Dienste, die geladenen Modelle und den Keycloak-Service-Account. Dies ist die erste Anlaufstelle bei Problemen — jeder rote Punkt enthält einen Lösungshinweis.</w:t>
-      </w:r>
-    </w:p>
-    <w:p>
-      <w:pPr>
-        <w:spacing w:after="40" w:before="40"/>
+        <w:spacing w:after="30" w:before="30"/>
       </w:pPr>
       <w:r>
         <w:t xml:space="preserve"/>
-      </w:r>
-    </w:p>
-    <w:p>
-      <w:pPr>
-        <w:pStyle w:val="Heading2"/>
-        <w:spacing w:after="100" w:before="260"/>
-      </w:pPr>
-      <w:r>
-        <w:rPr>
-          <w:rFonts w:ascii="Arial" w:cs="Arial" w:eastAsia="Arial" w:hAnsi="Arial"/>
-          <w:b/>
-          <w:bCs/>
-          <w:color w:val="333333"/>
-          <w:sz w:val="24"/>
-          <w:szCs w:val="24"/>
-        </w:rPr>
-        <w:t xml:space="preserve">7.2  E-Mail-Alarm (SMTP)</w:t>
-      </w:r>
-    </w:p>
-    <w:p>
-      <w:pPr>
-        <w:pStyle w:val="ListParagraph"/>
-        <w:numPr>
-          <w:ilvl w:val="0"/>
-          <w:numId w:val="2"/>
-        </w:numPr>
-        <w:spacing w:after="30" w:before="30"/>
-      </w:pPr>
-      <w:r>
-        <w:rPr>
-          <w:rFonts w:ascii="Arial" w:cs="Arial" w:eastAsia="Arial" w:hAnsi="Arial"/>
-          <w:color w:val="333333"/>
-          <w:sz w:val="20"/>
-          <w:szCs w:val="20"/>
-        </w:rPr>
-        <w:t xml:space="preserve">Unter Monitoring SMTP-Server, Absender und Empfänger hinterlegen und Alarm aktivieren.</w:t>
-      </w:r>
-    </w:p>
-    <w:p>
-      <w:pPr>
-        <w:pStyle w:val="ListParagraph"/>
-        <w:numPr>
-          <w:ilvl w:val="0"/>
-          <w:numId w:val="2"/>
-        </w:numPr>
-        <w:spacing w:after="30" w:before="30"/>
-      </w:pPr>
-      <w:r>
-        <w:rPr>
-          <w:rFonts w:ascii="Arial" w:cs="Arial" w:eastAsia="Arial" w:hAnsi="Arial"/>
-          <w:color w:val="333333"/>
-          <w:sz w:val="20"/>
-          <w:szCs w:val="20"/>
-        </w:rPr>
-        <w:t xml:space="preserve">Über Testnachricht senden die Konfiguration prüfen.</w:t>
-      </w:r>
-    </w:p>
-    <w:p>
-      <w:pPr>
-        <w:pStyle w:val="ListParagraph"/>
-        <w:numPr>
-          <w:ilvl w:val="0"/>
-          <w:numId w:val="2"/>
-        </w:numPr>
-        <w:spacing w:after="30" w:before="30"/>
-      </w:pPr>
-      <w:r>
-        <w:rPr>
-          <w:rFonts w:ascii="Arial" w:cs="Arial" w:eastAsia="Arial" w:hAnsi="Arial"/>
-          <w:color w:val="333333"/>
-          <w:sz w:val="20"/>
-          <w:szCs w:val="20"/>
-        </w:rPr>
-        <w:t xml:space="preserve">Bei Ausfällen oder fehlgeschlagenen Backups wird automatisch eine E-Mail versendet.</w:t>
-      </w:r>
-    </w:p>
-    <w:p>
-      <w:pPr>
-        <w:spacing w:after="40" w:before="40"/>
-      </w:pPr>
-      <w:r>
-        <w:t xml:space="preserve"/>
-      </w:r>
-    </w:p>
-    <w:p>
-      <w:pPr>
-        <w:pStyle w:val="Heading2"/>
-        <w:spacing w:after="100" w:before="260"/>
-      </w:pPr>
-      <w:r>
-        <w:rPr>
-          <w:rFonts w:ascii="Arial" w:cs="Arial" w:eastAsia="Arial" w:hAnsi="Arial"/>
-          <w:b/>
-          <w:bCs/>
-          <w:color w:val="333333"/>
-          <w:sz w:val="24"/>
-          <w:szCs w:val="24"/>
-        </w:rPr>
-        <w:t xml:space="preserve">7.3  Letzte Ereignisse</w:t>
-      </w:r>
-    </w:p>
-    <w:p>
-      <w:pPr>
-        <w:spacing w:after="70" w:before="70"/>
-      </w:pPr>
-      <w:r>
-        <w:rPr>
-          <w:rFonts w:ascii="Arial" w:cs="Arial" w:eastAsia="Arial" w:hAnsi="Arial"/>
-          <w:color w:val="333333"/>
-          <w:sz w:val="20"/>
-          <w:szCs w:val="20"/>
-        </w:rPr>
-        <w:t xml:space="preserve">Eine Liste der jüngsten Status-Änderungen und Fehler (z.B. Dienst kurz nicht erreichbar, Backup fehlgeschlagen) — ohne Inhalte, nur Metadaten.</w:t>
-      </w:r>
-    </w:p>
-    <w:p>
-      <w:pPr>
-        <w:pStyle w:val="Heading1"/>
-        <w:pageBreakBefore/>
-      </w:pPr>
-      <w:r>
-        <w:rPr>
-          <w:rFonts w:ascii="Arial" w:cs="Arial" w:eastAsia="Arial" w:hAnsi="Arial"/>
-          <w:b/>
-          <w:bCs/>
-          <w:color w:val="235FA6"/>
-          <w:sz w:val="30"/>
-          <w:szCs w:val="30"/>
-        </w:rPr>
-        <w:t xml:space="preserve">8  System steuern</w:t>
-      </w:r>
-    </w:p>
-    <w:p>
-      <w:pPr>
-        <w:spacing w:after="70" w:before="70"/>
-      </w:pPr>
-      <w:r>
-        <w:rPr>
-          <w:rFonts w:ascii="Arial" w:cs="Arial" w:eastAsia="Arial" w:hAnsi="Arial"/>
-          <w:color w:val="333333"/>
-          <w:sz w:val="20"/>
-          <w:szCs w:val="20"/>
-        </w:rPr>
-        <w:t xml:space="preserve">Im Tab Einstellungen unter System steuern lassen sich direkt aus dem Browser ausführen:</w:t>
-      </w:r>
-    </w:p>
-    <w:p>
-      <w:pPr>
-        <w:pStyle w:val="ListParagraph"/>
-        <w:numPr>
-          <w:ilvl w:val="0"/>
-          <w:numId w:val="2"/>
-        </w:numPr>
-        <w:spacing w:after="30" w:before="30"/>
-      </w:pPr>
-      <w:r>
-        <w:rPr>
-          <w:rFonts w:ascii="Arial" w:cs="Arial" w:eastAsia="Arial" w:hAnsi="Arial"/>
-          <w:color w:val="333333"/>
-          <w:sz w:val="20"/>
-          <w:szCs w:val="20"/>
-        </w:rPr>
-        <w:t xml:space="preserve">Dienste neu starten — startet die Plattform-Container neu (z.B. nach Konfigurationsänderungen).</w:t>
-      </w:r>
-    </w:p>
-    <w:p>
-      <w:pPr>
-        <w:pStyle w:val="ListParagraph"/>
-        <w:numPr>
-          <w:ilvl w:val="0"/>
-          <w:numId w:val="2"/>
-        </w:numPr>
-        <w:spacing w:after="30" w:before="30"/>
-      </w:pPr>
-      <w:r>
-        <w:rPr>
-          <w:rFonts w:ascii="Arial" w:cs="Arial" w:eastAsia="Arial" w:hAnsi="Arial"/>
-          <w:color w:val="333333"/>
-          <w:sz w:val="20"/>
-          <w:szCs w:val="20"/>
-        </w:rPr>
-        <w:t xml:space="preserve">Server neu starten / herunterfahren — steuert den gesamten DGX.</w:t>
       </w:r>
     </w:p>
     <w:tbl>
@@ -4633,7 +4732,7 @@
                 <w:sz w:val="20"/>
                 <w:szCs w:val="20"/>
               </w:rPr>
-              <w:t xml:space="preserve">Mit Bedacht verwenden</w:t>
+              <w:t xml:space="preserve">Drei Dinge müssen zusammenpassen</w:t>
             </w:r>
           </w:p>
           <w:p>
@@ -4647,7 +4746,7 @@
                 <w:sz w:val="19"/>
                 <w:szCs w:val="19"/>
               </w:rPr>
-              <w:t xml:space="preserve">Diese Aktionen sind root-äquivalent, daher nur für kv-admin verfügbar und</w:t>
+              <w:t xml:space="preserve">Sonst kommt „keine Antwort": (1) Modell installiert (⬇), (2) im Katalog aktiv,</w:t>
             </w:r>
           </w:p>
           <w:p>
@@ -4661,7 +4760,7 @@
                 <w:sz w:val="19"/>
                 <w:szCs w:val="19"/>
               </w:rPr>
-              <w:t xml:space="preserve">werden im Audit-Protokoll vermerkt. Nach 'Server herunterfahren' ist die</w:t>
+              <w:t xml:space="preserve">(3) als Standard-Antwortmodell gesetzt. Die Tabelle sperrt daher den Aktiv-Haken</w:t>
             </w:r>
           </w:p>
           <w:p>
@@ -4675,7 +4774,786 @@
                 <w:sz w:val="19"/>
                 <w:szCs w:val="19"/>
               </w:rPr>
+              <w:t xml:space="preserve">bei nicht installierten Modellen und bietet „Als Standard" nur bei installierten,</w:t>
+            </w:r>
+          </w:p>
+          <w:p>
+            <w:pPr>
+              <w:spacing w:after="35" w:before="35"/>
+            </w:pPr>
+            <w:r>
+              <w:rPr>
+                <w:rFonts w:ascii="Arial" w:cs="Arial" w:eastAsia="Arial" w:hAnsi="Arial"/>
+                <w:color w:val="333333"/>
+                <w:sz w:val="19"/>
+                <w:szCs w:val="19"/>
+              </w:rPr>
+              <w:t xml:space="preserve">aktiven, lokalen Modellen an.</w:t>
+            </w:r>
+          </w:p>
+        </w:tc>
+      </w:tr>
+    </w:tbl>
+    <w:p>
+      <w:pPr>
+        <w:spacing w:after="40" w:before="40"/>
+      </w:pPr>
+      <w:r>
+        <w:t xml:space="preserve"/>
+      </w:r>
+    </w:p>
+    <w:p>
+      <w:pPr>
+        <w:pStyle w:val="Heading2"/>
+        <w:spacing w:after="100" w:before="260"/>
+      </w:pPr>
+      <w:r>
+        <w:rPr>
+          <w:rFonts w:ascii="Arial" w:cs="Arial" w:eastAsia="Arial" w:hAnsi="Arial"/>
+          <w:b/>
+          <w:bCs/>
+          <w:color w:val="333333"/>
+          <w:sz w:val="24"/>
+          <w:szCs w:val="24"/>
+        </w:rPr>
+        <w:t xml:space="preserve">6.3  Externe Modelle und API-Keys</w:t>
+      </w:r>
+    </w:p>
+    <w:p>
+      <w:pPr>
+        <w:spacing w:after="70" w:before="70"/>
+      </w:pPr>
+      <w:r>
+        <w:rPr>
+          <w:rFonts w:ascii="Arial" w:cs="Arial" w:eastAsia="Arial" w:hAnsi="Arial"/>
+          <w:color w:val="333333"/>
+          <w:sz w:val="20"/>
+          <w:szCs w:val="20"/>
+        </w:rPr>
+        <w:t xml:space="preserve">Externe Modelle (OpenAI/Anthropic) sind standardmäßig deaktiviert. Zur Nutzung werden unter API-Keys die Schlüssel hinterlegt (verschlüsselt gespeichert, nie wieder angezeigt) und das gewünschte Modell aktiviert.</w:t>
+      </w:r>
+    </w:p>
+    <w:tbl>
+      <w:tblPr>
+        <w:tblW w:type="dxa" w:w="9638"/>
+        <w:tblBorders>
+          <w:top w:val="single" w:color="auto" w:sz="4"/>
+          <w:left w:val="single" w:color="auto" w:sz="4"/>
+          <w:bottom w:val="single" w:color="auto" w:sz="4"/>
+          <w:right w:val="single" w:color="auto" w:sz="4"/>
+          <w:insideH w:val="single" w:color="auto" w:sz="4"/>
+          <w:insideV w:val="single" w:color="auto" w:sz="4"/>
+        </w:tblBorders>
+      </w:tblPr>
+      <w:tblGrid>
+        <w:gridCol w:w="9638"/>
+      </w:tblGrid>
+      <w:tr>
+        <w:tc>
+          <w:tcPr>
+            <w:tcW w:type="dxa" w:w="9638"/>
+            <w:tcBorders>
+              <w:top w:val="single" w:color="C75B00" w:sz="1"/>
+              <w:left w:val="single" w:color="C75B00" w:sz="14"/>
+              <w:bottom w:val="single" w:color="C75B00" w:sz="1"/>
+              <w:right w:val="single" w:color="C75B00" w:sz="1"/>
+            </w:tcBorders>
+            <w:shd w:fill="FBF0E6" w:val="clear"/>
+            <w:tcMar>
+              <w:top w:type="dxa" w:w="110"/>
+              <w:left w:type="dxa" w:w="200"/>
+              <w:bottom w:type="dxa" w:w="110"/>
+              <w:right w:type="dxa" w:w="200"/>
+            </w:tcMar>
+          </w:tcPr>
+          <w:p>
+            <w:pPr>
+              <w:spacing w:after="50" w:before="50"/>
+            </w:pPr>
+            <w:r>
+              <w:rPr>
+                <w:rFonts w:ascii="Arial" w:cs="Arial" w:eastAsia="Arial" w:hAnsi="Arial"/>
+                <w:b/>
+                <w:bCs/>
+                <w:color w:val="C75B00"/>
+                <w:sz w:val="20"/>
+                <w:szCs w:val="20"/>
+              </w:rPr>
+              <w:t xml:space="preserve">Datenschutz bei externen Modellen</w:t>
+            </w:r>
+          </w:p>
+          <w:p>
+            <w:pPr>
+              <w:spacing w:after="35" w:before="35"/>
+            </w:pPr>
+            <w:r>
+              <w:rPr>
+                <w:rFonts w:ascii="Arial" w:cs="Arial" w:eastAsia="Arial" w:hAnsi="Arial"/>
+                <w:color w:val="333333"/>
+                <w:sz w:val="19"/>
+                <w:szCs w:val="19"/>
+              </w:rPr>
+              <w:t xml:space="preserve">Externe Modelle übertragen Nutzereingaben an Dritte außerhalb der Plattform.</w:t>
+            </w:r>
+          </w:p>
+          <w:p>
+            <w:pPr>
+              <w:spacing w:after="35" w:before="35"/>
+            </w:pPr>
+            <w:r>
+              <w:rPr>
+                <w:rFonts w:ascii="Arial" w:cs="Arial" w:eastAsia="Arial" w:hAnsi="Arial"/>
+                <w:color w:val="333333"/>
+                <w:sz w:val="19"/>
+                <w:szCs w:val="19"/>
+              </w:rPr>
+              <w:t xml:space="preserve">Aktivierung nur nach Freigabe durch den Datenschutzbeauftragten. In jeder</w:t>
+            </w:r>
+          </w:p>
+          <w:p>
+            <w:pPr>
+              <w:spacing w:after="35" w:before="35"/>
+            </w:pPr>
+            <w:r>
+              <w:rPr>
+                <w:rFonts w:ascii="Arial" w:cs="Arial" w:eastAsia="Arial" w:hAnsi="Arial"/>
+                <w:color w:val="333333"/>
+                <w:sz w:val="19"/>
+                <w:szCs w:val="19"/>
+              </w:rPr>
+              <w:t xml:space="preserve">Antwort sind externe Modelle klar als extern gekennzeichnet. Wissensbasis und</w:t>
+            </w:r>
+          </w:p>
+          <w:p>
+            <w:pPr>
+              <w:spacing w:after="35" w:before="35"/>
+            </w:pPr>
+            <w:r>
+              <w:rPr>
+                <w:rFonts w:ascii="Arial" w:cs="Arial" w:eastAsia="Arial" w:hAnsi="Arial"/>
+                <w:color w:val="333333"/>
+                <w:sz w:val="19"/>
+                <w:szCs w:val="19"/>
+              </w:rPr>
+              <w:t xml:space="preserve">ELO nutzen niemals externe Modelle.</w:t>
+            </w:r>
+          </w:p>
+        </w:tc>
+      </w:tr>
+    </w:tbl>
+    <w:p>
+      <w:pPr>
+        <w:pStyle w:val="Heading1"/>
+        <w:pageBreakBefore/>
+      </w:pPr>
+      <w:r>
+        <w:rPr>
+          <w:rFonts w:ascii="Arial" w:cs="Arial" w:eastAsia="Arial" w:hAnsi="Arial"/>
+          <w:b/>
+          <w:bCs/>
+          <w:color w:val="235FA6"/>
+          <w:sz w:val="30"/>
+          <w:szCs w:val="30"/>
+        </w:rPr>
+        <w:t xml:space="preserve">7  Monitoring und E-Mail-Alarm</w:t>
+      </w:r>
+    </w:p>
+    <w:p>
+      <w:pPr>
+        <w:pStyle w:val="Heading2"/>
+        <w:spacing w:after="100" w:before="260"/>
+      </w:pPr>
+      <w:r>
+        <w:rPr>
+          <w:rFonts w:ascii="Arial" w:cs="Arial" w:eastAsia="Arial" w:hAnsi="Arial"/>
+          <w:b/>
+          <w:bCs/>
+          <w:color w:val="333333"/>
+          <w:sz w:val="24"/>
+          <w:szCs w:val="24"/>
+        </w:rPr>
+        <w:t xml:space="preserve">7.1  Systemstatus</w:t>
+      </w:r>
+    </w:p>
+    <w:p>
+      <w:pPr>
+        <w:spacing w:after="70" w:before="70"/>
+      </w:pPr>
+      <w:r>
+        <w:rPr>
+          <w:rFonts w:ascii="Arial" w:cs="Arial" w:eastAsia="Arial" w:hAnsi="Arial"/>
+          <w:color w:val="333333"/>
+          <w:sz w:val="20"/>
+          <w:szCs w:val="20"/>
+        </w:rPr>
+        <w:t xml:space="preserve">Im Tab Einstellungen prüft der Systemstatus alle Dienste, die geladenen Modelle und den Keycloak-Service-Account. Dies ist die erste Anlaufstelle bei Problemen — jeder rote Punkt enthält einen Lösungshinweis.</w:t>
+      </w:r>
+    </w:p>
+    <w:p>
+      <w:pPr>
+        <w:spacing w:after="40" w:before="40"/>
+      </w:pPr>
+      <w:r>
+        <w:t xml:space="preserve"/>
+      </w:r>
+    </w:p>
+    <w:p>
+      <w:pPr>
+        <w:pStyle w:val="Heading2"/>
+        <w:spacing w:after="100" w:before="260"/>
+      </w:pPr>
+      <w:r>
+        <w:rPr>
+          <w:rFonts w:ascii="Arial" w:cs="Arial" w:eastAsia="Arial" w:hAnsi="Arial"/>
+          <w:b/>
+          <w:bCs/>
+          <w:color w:val="333333"/>
+          <w:sz w:val="24"/>
+          <w:szCs w:val="24"/>
+        </w:rPr>
+        <w:t xml:space="preserve">7.2  E-Mail-Alarm (SMTP)</w:t>
+      </w:r>
+    </w:p>
+    <w:p>
+      <w:pPr>
+        <w:pStyle w:val="ListParagraph"/>
+        <w:numPr>
+          <w:ilvl w:val="0"/>
+          <w:numId w:val="2"/>
+        </w:numPr>
+        <w:spacing w:after="30" w:before="30"/>
+      </w:pPr>
+      <w:r>
+        <w:rPr>
+          <w:rFonts w:ascii="Arial" w:cs="Arial" w:eastAsia="Arial" w:hAnsi="Arial"/>
+          <w:color w:val="333333"/>
+          <w:sz w:val="20"/>
+          <w:szCs w:val="20"/>
+        </w:rPr>
+        <w:t xml:space="preserve">Unter Monitoring SMTP-Server, Absender und Empfänger hinterlegen und Alarm aktivieren.</w:t>
+      </w:r>
+    </w:p>
+    <w:p>
+      <w:pPr>
+        <w:pStyle w:val="ListParagraph"/>
+        <w:numPr>
+          <w:ilvl w:val="0"/>
+          <w:numId w:val="2"/>
+        </w:numPr>
+        <w:spacing w:after="30" w:before="30"/>
+      </w:pPr>
+      <w:r>
+        <w:rPr>
+          <w:rFonts w:ascii="Arial" w:cs="Arial" w:eastAsia="Arial" w:hAnsi="Arial"/>
+          <w:color w:val="333333"/>
+          <w:sz w:val="20"/>
+          <w:szCs w:val="20"/>
+        </w:rPr>
+        <w:t xml:space="preserve">Über Testnachricht senden die Konfiguration prüfen.</w:t>
+      </w:r>
+    </w:p>
+    <w:p>
+      <w:pPr>
+        <w:pStyle w:val="ListParagraph"/>
+        <w:numPr>
+          <w:ilvl w:val="0"/>
+          <w:numId w:val="2"/>
+        </w:numPr>
+        <w:spacing w:after="30" w:before="30"/>
+      </w:pPr>
+      <w:r>
+        <w:rPr>
+          <w:rFonts w:ascii="Arial" w:cs="Arial" w:eastAsia="Arial" w:hAnsi="Arial"/>
+          <w:color w:val="333333"/>
+          <w:sz w:val="20"/>
+          <w:szCs w:val="20"/>
+        </w:rPr>
+        <w:t xml:space="preserve">Bei Ausfällen oder fehlgeschlagenen Backups wird automatisch eine E-Mail versendet.</w:t>
+      </w:r>
+    </w:p>
+    <w:p>
+      <w:pPr>
+        <w:spacing w:after="40" w:before="40"/>
+      </w:pPr>
+      <w:r>
+        <w:t xml:space="preserve"/>
+      </w:r>
+    </w:p>
+    <w:p>
+      <w:pPr>
+        <w:pStyle w:val="Heading2"/>
+        <w:spacing w:after="100" w:before="260"/>
+      </w:pPr>
+      <w:r>
+        <w:rPr>
+          <w:rFonts w:ascii="Arial" w:cs="Arial" w:eastAsia="Arial" w:hAnsi="Arial"/>
+          <w:b/>
+          <w:bCs/>
+          <w:color w:val="333333"/>
+          <w:sz w:val="24"/>
+          <w:szCs w:val="24"/>
+        </w:rPr>
+        <w:t xml:space="preserve">7.3  Letzte Ereignisse</w:t>
+      </w:r>
+    </w:p>
+    <w:p>
+      <w:pPr>
+        <w:spacing w:after="70" w:before="70"/>
+      </w:pPr>
+      <w:r>
+        <w:rPr>
+          <w:rFonts w:ascii="Arial" w:cs="Arial" w:eastAsia="Arial" w:hAnsi="Arial"/>
+          <w:color w:val="333333"/>
+          <w:sz w:val="20"/>
+          <w:szCs w:val="20"/>
+        </w:rPr>
+        <w:t xml:space="preserve">Eine Liste der jüngsten Status-Änderungen und Fehler (z.B. Dienst kurz nicht erreichbar, Backup fehlgeschlagen) — ohne Inhalte, nur Metadaten.</w:t>
+      </w:r>
+    </w:p>
+    <w:p>
+      <w:pPr>
+        <w:pStyle w:val="Heading1"/>
+        <w:pageBreakBefore/>
+      </w:pPr>
+      <w:r>
+        <w:rPr>
+          <w:rFonts w:ascii="Arial" w:cs="Arial" w:eastAsia="Arial" w:hAnsi="Arial"/>
+          <w:b/>
+          <w:bCs/>
+          <w:color w:val="235FA6"/>
+          <w:sz w:val="30"/>
+          <w:szCs w:val="30"/>
+        </w:rPr>
+        <w:t xml:space="preserve">8  System und Erscheinungsbild</w:t>
+      </w:r>
+    </w:p>
+    <w:p>
+      <w:pPr>
+        <w:pStyle w:val="Heading2"/>
+        <w:spacing w:after="100" w:before="260"/>
+      </w:pPr>
+      <w:r>
+        <w:rPr>
+          <w:rFonts w:ascii="Arial" w:cs="Arial" w:eastAsia="Arial" w:hAnsi="Arial"/>
+          <w:b/>
+          <w:bCs/>
+          <w:color w:val="333333"/>
+          <w:sz w:val="24"/>
+          <w:szCs w:val="24"/>
+        </w:rPr>
+        <w:t xml:space="preserve">8.1  System steuern</w:t>
+      </w:r>
+    </w:p>
+    <w:p>
+      <w:pPr>
+        <w:spacing w:after="70" w:before="70"/>
+      </w:pPr>
+      <w:r>
+        <w:rPr>
+          <w:rFonts w:ascii="Arial" w:cs="Arial" w:eastAsia="Arial" w:hAnsi="Arial"/>
+          <w:color w:val="333333"/>
+          <w:sz w:val="20"/>
+          <w:szCs w:val="20"/>
+        </w:rPr>
+        <w:t xml:space="preserve">Im Tab Einstellungen unter System steuern lassen sich direkt aus dem Browser ausführen:</w:t>
+      </w:r>
+    </w:p>
+    <w:p>
+      <w:pPr>
+        <w:pStyle w:val="ListParagraph"/>
+        <w:numPr>
+          <w:ilvl w:val="0"/>
+          <w:numId w:val="2"/>
+        </w:numPr>
+        <w:spacing w:after="30" w:before="30"/>
+      </w:pPr>
+      <w:r>
+        <w:rPr>
+          <w:rFonts w:ascii="Arial" w:cs="Arial" w:eastAsia="Arial" w:hAnsi="Arial"/>
+          <w:color w:val="333333"/>
+          <w:sz w:val="20"/>
+          <w:szCs w:val="20"/>
+        </w:rPr>
+        <w:t xml:space="preserve">Dienste neu starten — startet die Plattform-Container neu (z.B. nach Konfigurationsänderungen).</w:t>
+      </w:r>
+    </w:p>
+    <w:p>
+      <w:pPr>
+        <w:pStyle w:val="ListParagraph"/>
+        <w:numPr>
+          <w:ilvl w:val="0"/>
+          <w:numId w:val="2"/>
+        </w:numPr>
+        <w:spacing w:after="30" w:before="30"/>
+      </w:pPr>
+      <w:r>
+        <w:rPr>
+          <w:rFonts w:ascii="Arial" w:cs="Arial" w:eastAsia="Arial" w:hAnsi="Arial"/>
+          <w:color w:val="333333"/>
+          <w:sz w:val="20"/>
+          <w:szCs w:val="20"/>
+        </w:rPr>
+        <w:t xml:space="preserve">Server neu starten / herunterfahren — steuert den gesamten DGX.</w:t>
+      </w:r>
+    </w:p>
+    <w:tbl>
+      <w:tblPr>
+        <w:tblW w:type="dxa" w:w="9638"/>
+        <w:tblBorders>
+          <w:top w:val="single" w:color="auto" w:sz="4"/>
+          <w:left w:val="single" w:color="auto" w:sz="4"/>
+          <w:bottom w:val="single" w:color="auto" w:sz="4"/>
+          <w:right w:val="single" w:color="auto" w:sz="4"/>
+          <w:insideH w:val="single" w:color="auto" w:sz="4"/>
+          <w:insideV w:val="single" w:color="auto" w:sz="4"/>
+        </w:tblBorders>
+      </w:tblPr>
+      <w:tblGrid>
+        <w:gridCol w:w="9638"/>
+      </w:tblGrid>
+      <w:tr>
+        <w:tc>
+          <w:tcPr>
+            <w:tcW w:type="dxa" w:w="9638"/>
+            <w:tcBorders>
+              <w:top w:val="single" w:color="C75B00" w:sz="1"/>
+              <w:left w:val="single" w:color="C75B00" w:sz="14"/>
+              <w:bottom w:val="single" w:color="C75B00" w:sz="1"/>
+              <w:right w:val="single" w:color="C75B00" w:sz="1"/>
+            </w:tcBorders>
+            <w:shd w:fill="FBF0E6" w:val="clear"/>
+            <w:tcMar>
+              <w:top w:type="dxa" w:w="110"/>
+              <w:left w:type="dxa" w:w="200"/>
+              <w:bottom w:type="dxa" w:w="110"/>
+              <w:right w:type="dxa" w:w="200"/>
+            </w:tcMar>
+          </w:tcPr>
+          <w:p>
+            <w:pPr>
+              <w:spacing w:after="50" w:before="50"/>
+            </w:pPr>
+            <w:r>
+              <w:rPr>
+                <w:rFonts w:ascii="Arial" w:cs="Arial" w:eastAsia="Arial" w:hAnsi="Arial"/>
+                <w:b/>
+                <w:bCs/>
+                <w:color w:val="C75B00"/>
+                <w:sz w:val="20"/>
+                <w:szCs w:val="20"/>
+              </w:rPr>
+              <w:t xml:space="preserve">Mit Bedacht verwenden</w:t>
+            </w:r>
+          </w:p>
+          <w:p>
+            <w:pPr>
+              <w:spacing w:after="35" w:before="35"/>
+            </w:pPr>
+            <w:r>
+              <w:rPr>
+                <w:rFonts w:ascii="Arial" w:cs="Arial" w:eastAsia="Arial" w:hAnsi="Arial"/>
+                <w:color w:val="333333"/>
+                <w:sz w:val="19"/>
+                <w:szCs w:val="19"/>
+              </w:rPr>
+              <w:t xml:space="preserve">Diese Aktionen sind root-äquivalent, daher nur für kv-admin verfügbar und</w:t>
+            </w:r>
+          </w:p>
+          <w:p>
+            <w:pPr>
+              <w:spacing w:after="35" w:before="35"/>
+            </w:pPr>
+            <w:r>
+              <w:rPr>
+                <w:rFonts w:ascii="Arial" w:cs="Arial" w:eastAsia="Arial" w:hAnsi="Arial"/>
+                <w:color w:val="333333"/>
+                <w:sz w:val="19"/>
+                <w:szCs w:val="19"/>
+              </w:rPr>
+              <w:t xml:space="preserve">werden im Audit-Protokoll vermerkt. Nach 'Server herunterfahren' ist die</w:t>
+            </w:r>
+          </w:p>
+          <w:p>
+            <w:pPr>
+              <w:spacing w:after="35" w:before="35"/>
+            </w:pPr>
+            <w:r>
+              <w:rPr>
+                <w:rFonts w:ascii="Arial" w:cs="Arial" w:eastAsia="Arial" w:hAnsi="Arial"/>
+                <w:color w:val="333333"/>
+                <w:sz w:val="19"/>
+                <w:szCs w:val="19"/>
+              </w:rPr>
               <w:t xml:space="preserve">Plattform erst nach physischem/Remote-Einschalten wieder erreichbar.</w:t>
+            </w:r>
+          </w:p>
+        </w:tc>
+      </w:tr>
+    </w:tbl>
+    <w:p>
+      <w:pPr>
+        <w:spacing w:after="40" w:before="40"/>
+      </w:pPr>
+      <w:r>
+        <w:t xml:space="preserve"/>
+      </w:r>
+    </w:p>
+    <w:p>
+      <w:pPr>
+        <w:pStyle w:val="Heading2"/>
+        <w:spacing w:after="100" w:before="260"/>
+      </w:pPr>
+      <w:r>
+        <w:rPr>
+          <w:rFonts w:ascii="Arial" w:cs="Arial" w:eastAsia="Arial" w:hAnsi="Arial"/>
+          <w:b/>
+          <w:bCs/>
+          <w:color w:val="333333"/>
+          <w:sz w:val="24"/>
+          <w:szCs w:val="24"/>
+        </w:rPr>
+        <w:t xml:space="preserve">8.2  Eigenes Logo</w:t>
+      </w:r>
+    </w:p>
+    <w:p>
+      <w:pPr>
+        <w:spacing w:after="70" w:before="70"/>
+      </w:pPr>
+      <w:r>
+        <w:rPr>
+          <w:rFonts w:ascii="Arial" w:cs="Arial" w:eastAsia="Arial" w:hAnsi="Arial"/>
+          <w:color w:val="333333"/>
+          <w:sz w:val="20"/>
+          <w:szCs w:val="20"/>
+        </w:rPr>
+        <w:t xml:space="preserve">Unter Einstellungen → Eigenes Logo lässt sich das Logo der Plattform austauschen. Ein einziger Upload versorgt alle Stellen:</w:t>
+      </w:r>
+    </w:p>
+    <w:p>
+      <w:pPr>
+        <w:pStyle w:val="ListParagraph"/>
+        <w:numPr>
+          <w:ilvl w:val="0"/>
+          <w:numId w:val="2"/>
+        </w:numPr>
+        <w:spacing w:after="30" w:before="30"/>
+      </w:pPr>
+      <w:r>
+        <w:rPr>
+          <w:rFonts w:ascii="Arial" w:cs="Arial" w:eastAsia="Arial" w:hAnsi="Arial"/>
+          <w:color w:val="333333"/>
+          <w:sz w:val="20"/>
+          <w:szCs w:val="20"/>
+        </w:rPr>
+        <w:t xml:space="preserve">die Kopfzeile im Verwaltungs-UI (mit Sofort-Vorschau in der Karte),</w:t>
+      </w:r>
+    </w:p>
+    <w:p>
+      <w:pPr>
+        <w:pStyle w:val="ListParagraph"/>
+        <w:numPr>
+          <w:ilvl w:val="0"/>
+          <w:numId w:val="2"/>
+        </w:numPr>
+        <w:spacing w:after="30" w:before="30"/>
+      </w:pPr>
+      <w:r>
+        <w:rPr>
+          <w:rFonts w:ascii="Arial" w:cs="Arial" w:eastAsia="Arial" w:hAnsi="Arial"/>
+          <w:color w:val="333333"/>
+          <w:sz w:val="20"/>
+          <w:szCs w:val="20"/>
+        </w:rPr>
+        <w:t xml:space="preserve">die Anmeldeseite (Login),</w:t>
+      </w:r>
+    </w:p>
+    <w:p>
+      <w:pPr>
+        <w:pStyle w:val="ListParagraph"/>
+        <w:numPr>
+          <w:ilvl w:val="0"/>
+          <w:numId w:val="2"/>
+        </w:numPr>
+        <w:spacing w:after="30" w:before="30"/>
+      </w:pPr>
+      <w:r>
+        <w:rPr>
+          <w:rFonts w:ascii="Arial" w:cs="Arial" w:eastAsia="Arial" w:hAnsi="Arial"/>
+          <w:color w:val="333333"/>
+          <w:sz w:val="20"/>
+          <w:szCs w:val="20"/>
+        </w:rPr>
+        <w:t xml:space="preserve">das Startbild und Favicon im Chat (Open WebUI).</w:t>
+      </w:r>
+    </w:p>
+    <w:p>
+      <w:pPr>
+        <w:spacing w:after="30" w:before="30"/>
+      </w:pPr>
+      <w:r>
+        <w:t xml:space="preserve"/>
+      </w:r>
+    </w:p>
+    <w:p>
+      <w:pPr>
+        <w:pStyle w:val="ListParagraph"/>
+        <w:numPr>
+          <w:ilvl w:val="0"/>
+          <w:numId w:val="3"/>
+        </w:numPr>
+        <w:spacing w:after="40" w:before="40"/>
+      </w:pPr>
+      <w:r>
+        <w:rPr>
+          <w:rFonts w:ascii="Arial" w:cs="Arial" w:eastAsia="Arial" w:hAnsi="Arial"/>
+          <w:color w:val="333333"/>
+          <w:sz w:val="20"/>
+          <w:szCs w:val="20"/>
+        </w:rPr>
+        <w:t xml:space="preserve">PNG auswählen (transparenter Hintergrund empfohlen, mindestens 500 px breit, max. 2 MB).</w:t>
+      </w:r>
+    </w:p>
+    <w:p>
+      <w:pPr>
+        <w:pStyle w:val="ListParagraph"/>
+        <w:numPr>
+          <w:ilvl w:val="0"/>
+          <w:numId w:val="3"/>
+        </w:numPr>
+        <w:spacing w:after="40" w:before="40"/>
+      </w:pPr>
+      <w:r>
+        <w:rPr>
+          <w:rFonts w:ascii="Arial" w:cs="Arial" w:eastAsia="Arial" w:hAnsi="Arial"/>
+          <w:color w:val="333333"/>
+          <w:sz w:val="20"/>
+          <w:szCs w:val="20"/>
+        </w:rPr>
+        <w:t xml:space="preserve">Das Logo wird verschlüsselt gespeichert und ist sofort im Verwaltungs-UI und auf der Anmeldeseite aktiv.</w:t>
+      </w:r>
+    </w:p>
+    <w:p>
+      <w:pPr>
+        <w:pStyle w:val="ListParagraph"/>
+        <w:numPr>
+          <w:ilvl w:val="0"/>
+          <w:numId w:val="3"/>
+        </w:numPr>
+        <w:spacing w:after="40" w:before="40"/>
+      </w:pPr>
+      <w:r>
+        <w:rPr>
+          <w:rFonts w:ascii="Arial" w:cs="Arial" w:eastAsia="Arial" w:hAnsi="Arial"/>
+          <w:color w:val="333333"/>
+          <w:sz w:val="20"/>
+          <w:szCs w:val="20"/>
+        </w:rPr>
+        <w:t xml:space="preserve">Im Chat und beim Favicon ggf. die Seite neu laden (Strg+F5) — Browser-Cache.</w:t>
+      </w:r>
+    </w:p>
+    <w:p>
+      <w:pPr>
+        <w:spacing w:after="70" w:before="70"/>
+      </w:pPr>
+      <w:r>
+        <w:rPr>
+          <w:rFonts w:ascii="Arial" w:cs="Arial" w:eastAsia="Arial" w:hAnsi="Arial"/>
+          <w:color w:val="333333"/>
+          <w:sz w:val="20"/>
+          <w:szCs w:val="20"/>
+        </w:rPr>
+        <w:t xml:space="preserve">Mit „Auf Standard zurücksetzen" wird wieder das mitgelieferte Standard-Logo gesetzt. Jeder Logo-Wechsel wird im Audit-Protokoll vermerkt.</w:t>
+      </w:r>
+    </w:p>
+    <w:tbl>
+      <w:tblPr>
+        <w:tblW w:type="dxa" w:w="9638"/>
+        <w:tblBorders>
+          <w:top w:val="single" w:color="auto" w:sz="4"/>
+          <w:left w:val="single" w:color="auto" w:sz="4"/>
+          <w:bottom w:val="single" w:color="auto" w:sz="4"/>
+          <w:right w:val="single" w:color="auto" w:sz="4"/>
+          <w:insideH w:val="single" w:color="auto" w:sz="4"/>
+          <w:insideV w:val="single" w:color="auto" w:sz="4"/>
+        </w:tblBorders>
+      </w:tblPr>
+      <w:tblGrid>
+        <w:gridCol w:w="9638"/>
+      </w:tblGrid>
+      <w:tr>
+        <w:tc>
+          <w:tcPr>
+            <w:tcW w:type="dxa" w:w="9638"/>
+            <w:tcBorders>
+              <w:top w:val="single" w:color="235FA6" w:sz="1"/>
+              <w:left w:val="single" w:color="235FA6" w:sz="14"/>
+              <w:bottom w:val="single" w:color="235FA6" w:sz="1"/>
+              <w:right w:val="single" w:color="235FA6" w:sz="1"/>
+            </w:tcBorders>
+            <w:shd w:fill="EAF1FA" w:val="clear"/>
+            <w:tcMar>
+              <w:top w:type="dxa" w:w="110"/>
+              <w:left w:type="dxa" w:w="200"/>
+              <w:bottom w:type="dxa" w:w="110"/>
+              <w:right w:type="dxa" w:w="200"/>
+            </w:tcMar>
+          </w:tcPr>
+          <w:p>
+            <w:pPr>
+              <w:spacing w:after="50" w:before="50"/>
+            </w:pPr>
+            <w:r>
+              <w:rPr>
+                <w:rFonts w:ascii="Arial" w:cs="Arial" w:eastAsia="Arial" w:hAnsi="Arial"/>
+                <w:b/>
+                <w:bCs/>
+                <w:color w:val="235FA6"/>
+                <w:sz w:val="20"/>
+                <w:szCs w:val="20"/>
+              </w:rPr>
+              <w:t xml:space="preserve">Robust hinterlegt</w:t>
+            </w:r>
+          </w:p>
+          <w:p>
+            <w:pPr>
+              <w:spacing w:after="35" w:before="35"/>
+            </w:pPr>
+            <w:r>
+              <w:rPr>
+                <w:rFonts w:ascii="Arial" w:cs="Arial" w:eastAsia="Arial" w:hAnsi="Arial"/>
+                <w:color w:val="333333"/>
+                <w:sz w:val="19"/>
+                <w:szCs w:val="19"/>
+              </w:rPr>
+              <w:t xml:space="preserve">Das eigene Logo liegt außerhalb der Programmdateien und übersteht Updates,</w:t>
+            </w:r>
+          </w:p>
+          <w:p>
+            <w:pPr>
+              <w:spacing w:after="35" w:before="35"/>
+            </w:pPr>
+            <w:r>
+              <w:rPr>
+                <w:rFonts w:ascii="Arial" w:cs="Arial" w:eastAsia="Arial" w:hAnsi="Arial"/>
+                <w:color w:val="333333"/>
+                <w:sz w:val="19"/>
+                <w:szCs w:val="19"/>
+              </w:rPr>
+              <w:t xml:space="preserve">Container-Neubauten und Neustarts. Es wird zudem in die Sicherung aufgenommen</w:t>
+            </w:r>
+          </w:p>
+          <w:p>
+            <w:pPr>
+              <w:spacing w:after="35" w:before="35"/>
+            </w:pPr>
+            <w:r>
+              <w:rPr>
+                <w:rFonts w:ascii="Arial" w:cs="Arial" w:eastAsia="Arial" w:hAnsi="Arial"/>
+                <w:color w:val="333333"/>
+                <w:sz w:val="19"/>
+                <w:szCs w:val="19"/>
+              </w:rPr>
+              <w:t xml:space="preserve">und beim Restore mit wiederhergestellt.</w:t>
             </w:r>
           </w:p>
         </w:tc>
@@ -6769,7 +7647,46 @@
           <w:sz w:val="20"/>
           <w:szCs w:val="20"/>
         </w:rPr>
-        <w:t xml:space="preserve">Bei fester IP ist nach einer einmaligen Änderung nichts weiter nötig. Falls sich die IP doch ändert, genügt ein Befehl — er erkennt die neue IP, korrigiert KEYCLOAK_PUBLIC_URL und die Redirect-URIs und startet die betroffenen Dienste neu:</w:t>
+        <w:t xml:space="preserve">Die Plattform passt sich bei einem IP-Wechsel selbstständig an — beim Booten und bei jeder Adressänderung (DHCP). Vor Ort genügt es, dem Server die neue IP zu geben; kein Befehl nötig. Ein Automatik-Dienst gleicht KEYCLOAK_PUBLIC_URL und die Keycloak-Redirect-URIs ab und startet die betroffenen Dienste neu (nur wenn sich etwas geändert hat).</w:t>
+      </w:r>
+    </w:p>
+    <w:p>
+      <w:pPr>
+        <w:spacing w:after="30" w:before="30"/>
+      </w:pPr>
+      <w:r>
+        <w:t xml:space="preserve"/>
+      </w:r>
+    </w:p>
+    <w:p>
+      <w:pPr>
+        <w:pStyle w:val="Heading2"/>
+        <w:spacing w:after="100" w:before="260"/>
+      </w:pPr>
+      <w:r>
+        <w:rPr>
+          <w:rFonts w:ascii="Arial" w:cs="Arial" w:eastAsia="Arial" w:hAnsi="Arial"/>
+          <w:b/>
+          <w:bCs/>
+          <w:color w:val="333333"/>
+          <w:sz w:val="24"/>
+          <w:szCs w:val="24"/>
+        </w:rPr>
+        <w:t xml:space="preserve">15.1  Automatik einrichten (einmalig)</w:t>
+      </w:r>
+    </w:p>
+    <w:p>
+      <w:pPr>
+        <w:spacing w:after="70" w:before="70"/>
+      </w:pPr>
+      <w:r>
+        <w:rPr>
+          <w:rFonts w:ascii="Arial" w:cs="Arial" w:eastAsia="Arial" w:hAnsi="Arial"/>
+          <w:color w:val="333333"/>
+          <w:sz w:val="20"/>
+          <w:szCs w:val="20"/>
+        </w:rPr>
+        <w:t xml:space="preserve">Bei einer Neuinstallation über setup_dgx.sh ist das bereits eingerichtet. Auf bestehenden Servern einmalig als root nachrüsten:</w:t>
       </w:r>
     </w:p>
     <w:tbl>
@@ -6816,7 +7733,138 @@
                 <w:sz w:val="18"/>
                 <w:szCs w:val="18"/>
               </w:rPr>
+              <w:t xml:space="preserve">sudo python3 scripts/set_host.py --install-auto</w:t>
+            </w:r>
+          </w:p>
+          <w:p>
+            <w:pPr>
+              <w:spacing w:after="20" w:before="20"/>
+            </w:pPr>
+            <w:r>
+              <w:rPr>
+                <w:rFonts w:ascii="Courier New" w:cs="Courier New" w:eastAsia="Courier New" w:hAnsi="Courier New"/>
+                <w:color w:val="D4D4D4"/>
+                <w:sz w:val="18"/>
+                <w:szCs w:val="18"/>
+              </w:rPr>
+              <w:t xml:space="preserve"># installiert einen systemd-Dienst (läuft bei jedem Boot) und einen</w:t>
+            </w:r>
+          </w:p>
+          <w:p>
+            <w:pPr>
+              <w:spacing w:after="20" w:before="20"/>
+            </w:pPr>
+            <w:r>
+              <w:rPr>
+                <w:rFonts w:ascii="Courier New" w:cs="Courier New" w:eastAsia="Courier New" w:hAnsi="Courier New"/>
+                <w:color w:val="D4D4D4"/>
+                <w:sz w:val="18"/>
+                <w:szCs w:val="18"/>
+              </w:rPr>
+              <w:t xml:space="preserve"># NetworkManager-Hook (läuft bei jedem IP-Wechsel)</w:t>
+            </w:r>
+          </w:p>
+        </w:tc>
+      </w:tr>
+    </w:tbl>
+    <w:p>
+      <w:pPr>
+        <w:spacing w:after="30" w:before="30"/>
+      </w:pPr>
+      <w:r>
+        <w:t xml:space="preserve"/>
+      </w:r>
+    </w:p>
+    <w:p>
+      <w:pPr>
+        <w:pStyle w:val="Heading2"/>
+        <w:spacing w:after="100" w:before="260"/>
+      </w:pPr>
+      <w:r>
+        <w:rPr>
+          <w:rFonts w:ascii="Arial" w:cs="Arial" w:eastAsia="Arial" w:hAnsi="Arial"/>
+          <w:b/>
+          <w:bCs/>
+          <w:color w:val="333333"/>
+          <w:sz w:val="24"/>
+          <w:szCs w:val="24"/>
+        </w:rPr>
+        <w:t xml:space="preserve">15.2  Manuell (Sonderfälle)</w:t>
+      </w:r>
+    </w:p>
+    <w:p>
+      <w:pPr>
+        <w:spacing w:after="70" w:before="70"/>
+      </w:pPr>
+      <w:r>
+        <w:rPr>
+          <w:rFonts w:ascii="Arial" w:cs="Arial" w:eastAsia="Arial" w:hAnsi="Arial"/>
+          <w:color w:val="333333"/>
+          <w:sz w:val="20"/>
+          <w:szCs w:val="20"/>
+        </w:rPr>
+        <w:t xml:space="preserve">Der manuelle Aufruf bleibt möglich, z.B. für den Umstieg auf einen öffentlichen Hostnamen mit HTTPS:</w:t>
+      </w:r>
+    </w:p>
+    <w:tbl>
+      <w:tblPr>
+        <w:tblW w:type="dxa" w:w="9638"/>
+        <w:tblBorders>
+          <w:top w:val="single" w:color="auto" w:sz="4"/>
+          <w:left w:val="single" w:color="auto" w:sz="4"/>
+          <w:bottom w:val="single" w:color="auto" w:sz="4"/>
+          <w:right w:val="single" w:color="auto" w:sz="4"/>
+          <w:insideH w:val="single" w:color="auto" w:sz="4"/>
+          <w:insideV w:val="single" w:color="auto" w:sz="4"/>
+        </w:tblBorders>
+      </w:tblPr>
+      <w:tblGrid>
+        <w:gridCol w:w="9638"/>
+      </w:tblGrid>
+      <w:tr>
+        <w:tc>
+          <w:tcPr>
+            <w:tcW w:type="dxa" w:w="9638"/>
+            <w:tcBorders>
+              <w:top w:val="single" w:color="888888" w:sz="1"/>
+              <w:left w:val="single" w:color="888888" w:sz="1"/>
+              <w:bottom w:val="single" w:color="888888" w:sz="1"/>
+              <w:right w:val="single" w:color="888888" w:sz="1"/>
+            </w:tcBorders>
+            <w:shd w:fill="1E1E1E" w:val="clear"/>
+            <w:tcMar>
+              <w:top w:type="dxa" w:w="120"/>
+              <w:left w:type="dxa" w:w="200"/>
+              <w:bottom w:type="dxa" w:w="120"/>
+              <w:right w:type="dxa" w:w="200"/>
+            </w:tcMar>
+          </w:tcPr>
+          <w:p>
+            <w:pPr>
+              <w:spacing w:after="20" w:before="20"/>
+            </w:pPr>
+            <w:r>
+              <w:rPr>
+                <w:rFonts w:ascii="Courier New" w:cs="Courier New" w:eastAsia="Courier New" w:hAnsi="Courier New"/>
+                <w:color w:val="D4D4D4"/>
+                <w:sz w:val="18"/>
+                <w:szCs w:val="18"/>
+              </w:rPr>
               <w:t xml:space="preserve">python3 scripts/set_host.py                     # interne IP automatisch</w:t>
+            </w:r>
+          </w:p>
+          <w:p>
+            <w:pPr>
+              <w:spacing w:after="20" w:before="20"/>
+            </w:pPr>
+            <w:r>
+              <w:rPr>
+                <w:rFonts w:ascii="Courier New" w:cs="Courier New" w:eastAsia="Courier New" w:hAnsi="Courier New"/>
+                <w:color w:val="D4D4D4"/>
+                <w:sz w:val="18"/>
+                <w:szCs w:val="18"/>
+              </w:rPr>
+              <w:t xml:space="preserve">python3 scripts/set_host.py 192.168.50.7        # IP explizit</w:t>
             </w:r>
           </w:p>
           <w:p>

</xml_diff>